<commit_message>
works on szakdolgozat projekt reszletezese react native
</commit_message>
<xml_diff>
--- a/BFK4J4_Szakdolgozat.docx
+++ b/BFK4J4_Szakdolgozat.docx
@@ -6,8 +6,6 @@
       <w:pPr>
         <w:pStyle w:val="Nyilatkozatcm"/>
       </w:pPr>
-      <w:bookmarkStart w:id="0" w:name="_GoBack"/>
-      <w:bookmarkEnd w:id="0"/>
       <w:r>
         <w:t>FELADATKIÍRÁS</w:t>
       </w:r>
@@ -270,7 +268,7 @@
       <w:r>
         <w:t>DR. Ekler Péter</w:t>
       </w:r>
-      <w:commentRangeStart w:id="1"/>
+      <w:commentRangeStart w:id="0"/>
       <w:r>
         <w:fldChar w:fldCharType="begin"/>
       </w:r>
@@ -280,13 +278,13 @@
       <w:r>
         <w:fldChar w:fldCharType="end"/>
       </w:r>
-      <w:commentRangeEnd w:id="1"/>
+      <w:commentRangeEnd w:id="0"/>
       <w:r>
         <w:rPr>
           <w:rStyle w:val="Jegyzethivatkozs"/>
           <w:noProof w:val="0"/>
         </w:rPr>
-        <w:commentReference w:id="1"/>
+        <w:commentReference w:id="0"/>
       </w:r>
     </w:p>
     <w:p>
@@ -298,7 +296,7 @@
       <w:r>
         <w:t xml:space="preserve">BUDAPEST, </w:t>
       </w:r>
-      <w:commentRangeStart w:id="2"/>
+      <w:commentRangeStart w:id="1"/>
       <w:r>
         <w:t>20</w:t>
       </w:r>
@@ -308,12 +306,12 @@
       <w:r>
         <w:t>5</w:t>
       </w:r>
-      <w:commentRangeEnd w:id="2"/>
+      <w:commentRangeEnd w:id="1"/>
       <w:r>
         <w:rPr>
           <w:rStyle w:val="Jegyzethivatkozs"/>
         </w:rPr>
-        <w:commentReference w:id="2"/>
+        <w:commentReference w:id="1"/>
       </w:r>
       <w:r>
         <w:fldChar w:fldCharType="begin"/>
@@ -373,7 +371,7 @@
           <w:r>
             <w:fldChar w:fldCharType="separate"/>
           </w:r>
-          <w:hyperlink w:anchor="_Toc213942476" w:history="1">
+          <w:hyperlink w:anchor="_Toc214019473" w:history="1">
             <w:r>
               <w:rPr>
                 <w:rStyle w:val="Hiperhivatkozs"/>
@@ -400,7 +398,7 @@
                 <w:noProof/>
                 <w:webHidden/>
               </w:rPr>
-              <w:instrText xml:space="preserve"> PAGEREF _Toc213942476 \h </w:instrText>
+              <w:instrText xml:space="preserve"> PAGEREF _Toc214019473 \h </w:instrText>
             </w:r>
             <w:r>
               <w:rPr>
@@ -443,7 +441,7 @@
               <w:lang w:eastAsia="hu-HU"/>
             </w:rPr>
           </w:pPr>
-          <w:hyperlink w:anchor="_Toc213942477" w:history="1">
+          <w:hyperlink w:anchor="_Toc214019474" w:history="1">
             <w:r>
               <w:rPr>
                 <w:rStyle w:val="Hiperhivatkozs"/>
@@ -470,7 +468,7 @@
                 <w:noProof/>
                 <w:webHidden/>
               </w:rPr>
-              <w:instrText xml:space="preserve"> PAGEREF _Toc213942477 \h </w:instrText>
+              <w:instrText xml:space="preserve"> PAGEREF _Toc214019474 \h </w:instrText>
             </w:r>
             <w:r>
               <w:rPr>
@@ -513,7 +511,7 @@
               <w:lang w:eastAsia="hu-HU"/>
             </w:rPr>
           </w:pPr>
-          <w:hyperlink w:anchor="_Toc213942478" w:history="1">
+          <w:hyperlink w:anchor="_Toc214019475" w:history="1">
             <w:r>
               <w:rPr>
                 <w:rStyle w:val="Hiperhivatkozs"/>
@@ -540,7 +538,7 @@
                 <w:noProof/>
                 <w:webHidden/>
               </w:rPr>
-              <w:instrText xml:space="preserve"> PAGEREF _Toc213942478 \h </w:instrText>
+              <w:instrText xml:space="preserve"> PAGEREF _Toc214019475 \h </w:instrText>
             </w:r>
             <w:r>
               <w:rPr>
@@ -585,7 +583,7 @@
               <w:lang w:eastAsia="hu-HU"/>
             </w:rPr>
           </w:pPr>
-          <w:hyperlink w:anchor="_Toc213942479" w:history="1">
+          <w:hyperlink w:anchor="_Toc214019476" w:history="1">
             <w:r>
               <w:rPr>
                 <w:rStyle w:val="Hiperhivatkozs"/>
@@ -612,7 +610,7 @@
                 <w:noProof/>
                 <w:webHidden/>
               </w:rPr>
-              <w:instrText xml:space="preserve"> PAGEREF _Toc213942479 \h </w:instrText>
+              <w:instrText xml:space="preserve"> PAGEREF _Toc214019476 \h </w:instrText>
             </w:r>
             <w:r>
               <w:rPr>
@@ -657,7 +655,7 @@
               <w:lang w:eastAsia="hu-HU"/>
             </w:rPr>
           </w:pPr>
-          <w:hyperlink w:anchor="_Toc213942480" w:history="1">
+          <w:hyperlink w:anchor="_Toc214019477" w:history="1">
             <w:r>
               <w:rPr>
                 <w:rStyle w:val="Hiperhivatkozs"/>
@@ -684,7 +682,7 @@
                 <w:noProof/>
                 <w:webHidden/>
               </w:rPr>
-              <w:instrText xml:space="preserve"> PAGEREF _Toc213942480 \h </w:instrText>
+              <w:instrText xml:space="preserve"> PAGEREF _Toc214019477 \h </w:instrText>
             </w:r>
             <w:r>
               <w:rPr>
@@ -729,7 +727,7 @@
               <w:lang w:eastAsia="hu-HU"/>
             </w:rPr>
           </w:pPr>
-          <w:hyperlink w:anchor="_Toc213942481" w:history="1">
+          <w:hyperlink w:anchor="_Toc214019478" w:history="1">
             <w:r>
               <w:rPr>
                 <w:rStyle w:val="Hiperhivatkozs"/>
@@ -756,7 +754,7 @@
                 <w:noProof/>
                 <w:webHidden/>
               </w:rPr>
-              <w:instrText xml:space="preserve"> PAGEREF _Toc213942481 \h </w:instrText>
+              <w:instrText xml:space="preserve"> PAGEREF _Toc214019478 \h </w:instrText>
             </w:r>
             <w:r>
               <w:rPr>
@@ -801,7 +799,7 @@
               <w:lang w:eastAsia="hu-HU"/>
             </w:rPr>
           </w:pPr>
-          <w:hyperlink w:anchor="_Toc213942482" w:history="1">
+          <w:hyperlink w:anchor="_Toc214019479" w:history="1">
             <w:r>
               <w:rPr>
                 <w:rStyle w:val="Hiperhivatkozs"/>
@@ -828,7 +826,7 @@
                 <w:noProof/>
                 <w:webHidden/>
               </w:rPr>
-              <w:instrText xml:space="preserve"> PAGEREF _Toc213942482 \h </w:instrText>
+              <w:instrText xml:space="preserve"> PAGEREF _Toc214019479 \h </w:instrText>
             </w:r>
             <w:r>
               <w:rPr>
@@ -871,7 +869,7 @@
               <w:lang w:eastAsia="hu-HU"/>
             </w:rPr>
           </w:pPr>
-          <w:hyperlink w:anchor="_Toc213942483" w:history="1">
+          <w:hyperlink w:anchor="_Toc214019480" w:history="1">
             <w:r>
               <w:rPr>
                 <w:rStyle w:val="Hiperhivatkozs"/>
@@ -898,7 +896,7 @@
                 <w:noProof/>
                 <w:webHidden/>
               </w:rPr>
-              <w:instrText xml:space="preserve"> PAGEREF _Toc213942483 \h </w:instrText>
+              <w:instrText xml:space="preserve"> PAGEREF _Toc214019480 \h </w:instrText>
             </w:r>
             <w:r>
               <w:rPr>
@@ -943,7 +941,7 @@
               <w:lang w:eastAsia="hu-HU"/>
             </w:rPr>
           </w:pPr>
-          <w:hyperlink w:anchor="_Toc213942484" w:history="1">
+          <w:hyperlink w:anchor="_Toc214019481" w:history="1">
             <w:r>
               <w:rPr>
                 <w:rStyle w:val="Hiperhivatkozs"/>
@@ -970,7 +968,7 @@
                 <w:noProof/>
                 <w:webHidden/>
               </w:rPr>
-              <w:instrText xml:space="preserve"> PAGEREF _Toc213942484 \h </w:instrText>
+              <w:instrText xml:space="preserve"> PAGEREF _Toc214019481 \h </w:instrText>
             </w:r>
             <w:r>
               <w:rPr>
@@ -1015,7 +1013,7 @@
               <w:lang w:eastAsia="hu-HU"/>
             </w:rPr>
           </w:pPr>
-          <w:hyperlink w:anchor="_Toc213942485" w:history="1">
+          <w:hyperlink w:anchor="_Toc214019482" w:history="1">
             <w:r>
               <w:rPr>
                 <w:rStyle w:val="Hiperhivatkozs"/>
@@ -1042,7 +1040,7 @@
                 <w:noProof/>
                 <w:webHidden/>
               </w:rPr>
-              <w:instrText xml:space="preserve"> PAGEREF _Toc213942485 \h </w:instrText>
+              <w:instrText xml:space="preserve"> PAGEREF _Toc214019482 \h </w:instrText>
             </w:r>
             <w:r>
               <w:rPr>
@@ -1087,7 +1085,7 @@
               <w:lang w:eastAsia="hu-HU"/>
             </w:rPr>
           </w:pPr>
-          <w:hyperlink w:anchor="_Toc213942486" w:history="1">
+          <w:hyperlink w:anchor="_Toc214019483" w:history="1">
             <w:r>
               <w:rPr>
                 <w:rStyle w:val="Hiperhivatkozs"/>
@@ -1114,7 +1112,7 @@
                 <w:noProof/>
                 <w:webHidden/>
               </w:rPr>
-              <w:instrText xml:space="preserve"> PAGEREF _Toc213942486 \h </w:instrText>
+              <w:instrText xml:space="preserve"> PAGEREF _Toc214019483 \h </w:instrText>
             </w:r>
             <w:r>
               <w:rPr>
@@ -1159,7 +1157,7 @@
               <w:lang w:eastAsia="hu-HU"/>
             </w:rPr>
           </w:pPr>
-          <w:hyperlink w:anchor="_Toc213942487" w:history="1">
+          <w:hyperlink w:anchor="_Toc214019484" w:history="1">
             <w:r>
               <w:rPr>
                 <w:rStyle w:val="Hiperhivatkozs"/>
@@ -1186,7 +1184,7 @@
                 <w:noProof/>
                 <w:webHidden/>
               </w:rPr>
-              <w:instrText xml:space="preserve"> PAGEREF _Toc213942487 \h </w:instrText>
+              <w:instrText xml:space="preserve"> PAGEREF _Toc214019484 \h </w:instrText>
             </w:r>
             <w:r>
               <w:rPr>
@@ -1231,7 +1229,7 @@
               <w:lang w:eastAsia="hu-HU"/>
             </w:rPr>
           </w:pPr>
-          <w:hyperlink w:anchor="_Toc213942488" w:history="1">
+          <w:hyperlink w:anchor="_Toc214019485" w:history="1">
             <w:r>
               <w:rPr>
                 <w:rStyle w:val="Hiperhivatkozs"/>
@@ -1258,7 +1256,7 @@
                 <w:noProof/>
                 <w:webHidden/>
               </w:rPr>
-              <w:instrText xml:space="preserve"> PAGEREF _Toc213942488 \h </w:instrText>
+              <w:instrText xml:space="preserve"> PAGEREF _Toc214019485 \h </w:instrText>
             </w:r>
             <w:r>
               <w:rPr>
@@ -1303,7 +1301,7 @@
               <w:lang w:eastAsia="hu-HU"/>
             </w:rPr>
           </w:pPr>
-          <w:hyperlink w:anchor="_Toc213942489" w:history="1">
+          <w:hyperlink w:anchor="_Toc214019486" w:history="1">
             <w:r>
               <w:rPr>
                 <w:rStyle w:val="Hiperhivatkozs"/>
@@ -1330,7 +1328,7 @@
                 <w:noProof/>
                 <w:webHidden/>
               </w:rPr>
-              <w:instrText xml:space="preserve"> PAGEREF _Toc213942489 \h </w:instrText>
+              <w:instrText xml:space="preserve"> PAGEREF _Toc214019486 \h </w:instrText>
             </w:r>
             <w:r>
               <w:rPr>
@@ -1375,7 +1373,7 @@
               <w:lang w:eastAsia="hu-HU"/>
             </w:rPr>
           </w:pPr>
-          <w:hyperlink w:anchor="_Toc213942490" w:history="1">
+          <w:hyperlink w:anchor="_Toc214019487" w:history="1">
             <w:r>
               <w:rPr>
                 <w:rStyle w:val="Hiperhivatkozs"/>
@@ -1402,7 +1400,7 @@
                 <w:noProof/>
                 <w:webHidden/>
               </w:rPr>
-              <w:instrText xml:space="preserve"> PAGEREF _Toc213942490 \h </w:instrText>
+              <w:instrText xml:space="preserve"> PAGEREF _Toc214019487 \h </w:instrText>
             </w:r>
             <w:r>
               <w:rPr>
@@ -1447,7 +1445,7 @@
               <w:lang w:eastAsia="hu-HU"/>
             </w:rPr>
           </w:pPr>
-          <w:hyperlink w:anchor="_Toc213942491" w:history="1">
+          <w:hyperlink w:anchor="_Toc214019488" w:history="1">
             <w:r>
               <w:rPr>
                 <w:rStyle w:val="Hiperhivatkozs"/>
@@ -1474,7 +1472,7 @@
                 <w:noProof/>
                 <w:webHidden/>
               </w:rPr>
-              <w:instrText xml:space="preserve"> PAGEREF _Toc213942491 \h </w:instrText>
+              <w:instrText xml:space="preserve"> PAGEREF _Toc214019488 \h </w:instrText>
             </w:r>
             <w:r>
               <w:rPr>
@@ -1519,7 +1517,7 @@
               <w:lang w:eastAsia="hu-HU"/>
             </w:rPr>
           </w:pPr>
-          <w:hyperlink w:anchor="_Toc213942492" w:history="1">
+          <w:hyperlink w:anchor="_Toc214019489" w:history="1">
             <w:r>
               <w:rPr>
                 <w:rStyle w:val="Hiperhivatkozs"/>
@@ -1546,7 +1544,7 @@
                 <w:noProof/>
                 <w:webHidden/>
               </w:rPr>
-              <w:instrText xml:space="preserve"> PAGEREF _Toc213942492 \h </w:instrText>
+              <w:instrText xml:space="preserve"> PAGEREF _Toc214019489 \h </w:instrText>
             </w:r>
             <w:r>
               <w:rPr>
@@ -1591,7 +1589,7 @@
               <w:lang w:eastAsia="hu-HU"/>
             </w:rPr>
           </w:pPr>
-          <w:hyperlink w:anchor="_Toc213942493" w:history="1">
+          <w:hyperlink w:anchor="_Toc214019490" w:history="1">
             <w:r>
               <w:rPr>
                 <w:rStyle w:val="Hiperhivatkozs"/>
@@ -1618,7 +1616,7 @@
                 <w:noProof/>
                 <w:webHidden/>
               </w:rPr>
-              <w:instrText xml:space="preserve"> PAGEREF _Toc213942493 \h </w:instrText>
+              <w:instrText xml:space="preserve"> PAGEREF _Toc214019490 \h </w:instrText>
             </w:r>
             <w:r>
               <w:rPr>
@@ -1663,7 +1661,7 @@
               <w:lang w:eastAsia="hu-HU"/>
             </w:rPr>
           </w:pPr>
-          <w:hyperlink w:anchor="_Toc213942494" w:history="1">
+          <w:hyperlink w:anchor="_Toc214019491" w:history="1">
             <w:r>
               <w:rPr>
                 <w:rStyle w:val="Hiperhivatkozs"/>
@@ -1690,7 +1688,7 @@
                 <w:noProof/>
                 <w:webHidden/>
               </w:rPr>
-              <w:instrText xml:space="preserve"> PAGEREF _Toc213942494 \h </w:instrText>
+              <w:instrText xml:space="preserve"> PAGEREF _Toc214019491 \h </w:instrText>
             </w:r>
             <w:r>
               <w:rPr>
@@ -1735,7 +1733,7 @@
               <w:lang w:eastAsia="hu-HU"/>
             </w:rPr>
           </w:pPr>
-          <w:hyperlink w:anchor="_Toc213942495" w:history="1">
+          <w:hyperlink w:anchor="_Toc214019492" w:history="1">
             <w:r>
               <w:rPr>
                 <w:rStyle w:val="Hiperhivatkozs"/>
@@ -1762,7 +1760,7 @@
                 <w:noProof/>
                 <w:webHidden/>
               </w:rPr>
-              <w:instrText xml:space="preserve"> PAGEREF _Toc213942495 \h </w:instrText>
+              <w:instrText xml:space="preserve"> PAGEREF _Toc214019492 \h </w:instrText>
             </w:r>
             <w:r>
               <w:rPr>
@@ -1807,7 +1805,7 @@
               <w:lang w:eastAsia="hu-HU"/>
             </w:rPr>
           </w:pPr>
-          <w:hyperlink w:anchor="_Toc213942496" w:history="1">
+          <w:hyperlink w:anchor="_Toc214019493" w:history="1">
             <w:r>
               <w:rPr>
                 <w:rStyle w:val="Hiperhivatkozs"/>
@@ -1834,7 +1832,7 @@
                 <w:noProof/>
                 <w:webHidden/>
               </w:rPr>
-              <w:instrText xml:space="preserve"> PAGEREF _Toc213942496 \h </w:instrText>
+              <w:instrText xml:space="preserve"> PAGEREF _Toc214019493 \h </w:instrText>
             </w:r>
             <w:r>
               <w:rPr>
@@ -1854,7 +1852,7 @@
                 <w:noProof/>
                 <w:webHidden/>
               </w:rPr>
-              <w:t>26</w:t>
+              <w:t>25</w:t>
             </w:r>
             <w:r>
               <w:rPr>
@@ -1879,7 +1877,7 @@
               <w:lang w:eastAsia="hu-HU"/>
             </w:rPr>
           </w:pPr>
-          <w:hyperlink w:anchor="_Toc213942497" w:history="1">
+          <w:hyperlink w:anchor="_Toc214019494" w:history="1">
             <w:r>
               <w:rPr>
                 <w:rStyle w:val="Hiperhivatkozs"/>
@@ -1906,7 +1904,7 @@
                 <w:noProof/>
                 <w:webHidden/>
               </w:rPr>
-              <w:instrText xml:space="preserve"> PAGEREF _Toc213942497 \h </w:instrText>
+              <w:instrText xml:space="preserve"> PAGEREF _Toc214019494 \h </w:instrText>
             </w:r>
             <w:r>
               <w:rPr>
@@ -1951,7 +1949,7 @@
               <w:lang w:eastAsia="hu-HU"/>
             </w:rPr>
           </w:pPr>
-          <w:hyperlink w:anchor="_Toc213942498" w:history="1">
+          <w:hyperlink w:anchor="_Toc214019495" w:history="1">
             <w:r>
               <w:rPr>
                 <w:rStyle w:val="Hiperhivatkozs"/>
@@ -1978,7 +1976,7 @@
                 <w:noProof/>
                 <w:webHidden/>
               </w:rPr>
-              <w:instrText xml:space="preserve"> PAGEREF _Toc213942498 \h </w:instrText>
+              <w:instrText xml:space="preserve"> PAGEREF _Toc214019495 \h </w:instrText>
             </w:r>
             <w:r>
               <w:rPr>
@@ -2023,7 +2021,7 @@
               <w:lang w:eastAsia="hu-HU"/>
             </w:rPr>
           </w:pPr>
-          <w:hyperlink w:anchor="_Toc213942499" w:history="1">
+          <w:hyperlink w:anchor="_Toc214019496" w:history="1">
             <w:r>
               <w:rPr>
                 <w:rStyle w:val="Hiperhivatkozs"/>
@@ -2050,7 +2048,7 @@
                 <w:noProof/>
                 <w:webHidden/>
               </w:rPr>
-              <w:instrText xml:space="preserve"> PAGEREF _Toc213942499 \h </w:instrText>
+              <w:instrText xml:space="preserve"> PAGEREF _Toc214019496 \h </w:instrText>
             </w:r>
             <w:r>
               <w:rPr>
@@ -2095,7 +2093,7 @@
               <w:lang w:eastAsia="hu-HU"/>
             </w:rPr>
           </w:pPr>
-          <w:hyperlink w:anchor="_Toc213942500" w:history="1">
+          <w:hyperlink w:anchor="_Toc214019497" w:history="1">
             <w:r>
               <w:rPr>
                 <w:rStyle w:val="Hiperhivatkozs"/>
@@ -2122,7 +2120,7 @@
                 <w:noProof/>
                 <w:webHidden/>
               </w:rPr>
-              <w:instrText xml:space="preserve"> PAGEREF _Toc213942500 \h </w:instrText>
+              <w:instrText xml:space="preserve"> PAGEREF _Toc214019497 \h </w:instrText>
             </w:r>
             <w:r>
               <w:rPr>
@@ -2167,7 +2165,7 @@
               <w:lang w:eastAsia="hu-HU"/>
             </w:rPr>
           </w:pPr>
-          <w:hyperlink w:anchor="_Toc213942501" w:history="1">
+          <w:hyperlink w:anchor="_Toc214019498" w:history="1">
             <w:r>
               <w:rPr>
                 <w:rStyle w:val="Hiperhivatkozs"/>
@@ -2194,7 +2192,7 @@
                 <w:noProof/>
                 <w:webHidden/>
               </w:rPr>
-              <w:instrText xml:space="preserve"> PAGEREF _Toc213942501 \h </w:instrText>
+              <w:instrText xml:space="preserve"> PAGEREF _Toc214019498 \h </w:instrText>
             </w:r>
             <w:r>
               <w:rPr>
@@ -2237,7 +2235,7 @@
               <w:lang w:eastAsia="hu-HU"/>
             </w:rPr>
           </w:pPr>
-          <w:hyperlink w:anchor="_Toc213942502" w:history="1">
+          <w:hyperlink w:anchor="_Toc214019499" w:history="1">
             <w:r>
               <w:rPr>
                 <w:rStyle w:val="Hiperhivatkozs"/>
@@ -2264,7 +2262,7 @@
                 <w:noProof/>
                 <w:webHidden/>
               </w:rPr>
-              <w:instrText xml:space="preserve"> PAGEREF _Toc213942502 \h </w:instrText>
+              <w:instrText xml:space="preserve"> PAGEREF _Toc214019499 \h </w:instrText>
             </w:r>
             <w:r>
               <w:rPr>
@@ -2309,7 +2307,7 @@
               <w:lang w:eastAsia="hu-HU"/>
             </w:rPr>
           </w:pPr>
-          <w:hyperlink w:anchor="_Toc213942503" w:history="1">
+          <w:hyperlink w:anchor="_Toc214019500" w:history="1">
             <w:r>
               <w:rPr>
                 <w:rStyle w:val="Hiperhivatkozs"/>
@@ -2336,7 +2334,7 @@
                 <w:noProof/>
                 <w:webHidden/>
               </w:rPr>
-              <w:instrText xml:space="preserve"> PAGEREF _Toc213942503 \h </w:instrText>
+              <w:instrText xml:space="preserve"> PAGEREF _Toc214019500 \h </w:instrText>
             </w:r>
             <w:r>
               <w:rPr>
@@ -2381,7 +2379,7 @@
               <w:lang w:eastAsia="hu-HU"/>
             </w:rPr>
           </w:pPr>
-          <w:hyperlink w:anchor="_Toc213942504" w:history="1">
+          <w:hyperlink w:anchor="_Toc214019501" w:history="1">
             <w:r>
               <w:rPr>
                 <w:rStyle w:val="Hiperhivatkozs"/>
@@ -2408,7 +2406,7 @@
                 <w:noProof/>
                 <w:webHidden/>
               </w:rPr>
-              <w:instrText xml:space="preserve"> PAGEREF _Toc213942504 \h </w:instrText>
+              <w:instrText xml:space="preserve"> PAGEREF _Toc214019501 \h </w:instrText>
             </w:r>
             <w:r>
               <w:rPr>
@@ -2453,7 +2451,7 @@
               <w:lang w:eastAsia="hu-HU"/>
             </w:rPr>
           </w:pPr>
-          <w:hyperlink w:anchor="_Toc213942505" w:history="1">
+          <w:hyperlink w:anchor="_Toc214019502" w:history="1">
             <w:r>
               <w:rPr>
                 <w:rStyle w:val="Hiperhivatkozs"/>
@@ -2480,7 +2478,7 @@
                 <w:noProof/>
                 <w:webHidden/>
               </w:rPr>
-              <w:instrText xml:space="preserve"> PAGEREF _Toc213942505 \h </w:instrText>
+              <w:instrText xml:space="preserve"> PAGEREF _Toc214019502 \h </w:instrText>
             </w:r>
             <w:r>
               <w:rPr>
@@ -2525,7 +2523,7 @@
               <w:lang w:eastAsia="hu-HU"/>
             </w:rPr>
           </w:pPr>
-          <w:hyperlink w:anchor="_Toc213942506" w:history="1">
+          <w:hyperlink w:anchor="_Toc214019503" w:history="1">
             <w:r>
               <w:rPr>
                 <w:rStyle w:val="Hiperhivatkozs"/>
@@ -2552,7 +2550,7 @@
                 <w:noProof/>
                 <w:webHidden/>
               </w:rPr>
-              <w:instrText xml:space="preserve"> PAGEREF _Toc213942506 \h </w:instrText>
+              <w:instrText xml:space="preserve"> PAGEREF _Toc214019503 \h </w:instrText>
             </w:r>
             <w:r>
               <w:rPr>
@@ -2597,7 +2595,7 @@
               <w:lang w:eastAsia="hu-HU"/>
             </w:rPr>
           </w:pPr>
-          <w:hyperlink w:anchor="_Toc213942507" w:history="1">
+          <w:hyperlink w:anchor="_Toc214019504" w:history="1">
             <w:r>
               <w:rPr>
                 <w:rStyle w:val="Hiperhivatkozs"/>
@@ -2624,7 +2622,7 @@
                 <w:noProof/>
                 <w:webHidden/>
               </w:rPr>
-              <w:instrText xml:space="preserve"> PAGEREF _Toc213942507 \h </w:instrText>
+              <w:instrText xml:space="preserve"> PAGEREF _Toc214019504 \h </w:instrText>
             </w:r>
             <w:r>
               <w:rPr>
@@ -2669,7 +2667,7 @@
               <w:lang w:eastAsia="hu-HU"/>
             </w:rPr>
           </w:pPr>
-          <w:hyperlink w:anchor="_Toc213942508" w:history="1">
+          <w:hyperlink w:anchor="_Toc214019505" w:history="1">
             <w:r>
               <w:rPr>
                 <w:rStyle w:val="Hiperhivatkozs"/>
@@ -2696,7 +2694,7 @@
                 <w:noProof/>
                 <w:webHidden/>
               </w:rPr>
-              <w:instrText xml:space="preserve"> PAGEREF _Toc213942508 \h </w:instrText>
+              <w:instrText xml:space="preserve"> PAGEREF _Toc214019505 \h </w:instrText>
             </w:r>
             <w:r>
               <w:rPr>
@@ -2741,7 +2739,7 @@
               <w:lang w:eastAsia="hu-HU"/>
             </w:rPr>
           </w:pPr>
-          <w:hyperlink w:anchor="_Toc213942509" w:history="1">
+          <w:hyperlink w:anchor="_Toc214019506" w:history="1">
             <w:r>
               <w:rPr>
                 <w:rStyle w:val="Hiperhivatkozs"/>
@@ -2768,7 +2766,7 @@
                 <w:noProof/>
                 <w:webHidden/>
               </w:rPr>
-              <w:instrText xml:space="preserve"> PAGEREF _Toc213942509 \h </w:instrText>
+              <w:instrText xml:space="preserve"> PAGEREF _Toc214019506 \h </w:instrText>
             </w:r>
             <w:r>
               <w:rPr>
@@ -2813,7 +2811,7 @@
               <w:lang w:eastAsia="hu-HU"/>
             </w:rPr>
           </w:pPr>
-          <w:hyperlink w:anchor="_Toc213942510" w:history="1">
+          <w:hyperlink w:anchor="_Toc214019507" w:history="1">
             <w:r>
               <w:rPr>
                 <w:rStyle w:val="Hiperhivatkozs"/>
@@ -2840,7 +2838,7 @@
                 <w:noProof/>
                 <w:webHidden/>
               </w:rPr>
-              <w:instrText xml:space="preserve"> PAGEREF _Toc213942510 \h </w:instrText>
+              <w:instrText xml:space="preserve"> PAGEREF _Toc214019507 \h </w:instrText>
             </w:r>
             <w:r>
               <w:rPr>
@@ -2885,7 +2883,7 @@
               <w:lang w:eastAsia="hu-HU"/>
             </w:rPr>
           </w:pPr>
-          <w:hyperlink w:anchor="_Toc213942511" w:history="1">
+          <w:hyperlink w:anchor="_Toc214019508" w:history="1">
             <w:r>
               <w:rPr>
                 <w:rStyle w:val="Hiperhivatkozs"/>
@@ -2912,7 +2910,7 @@
                 <w:noProof/>
                 <w:webHidden/>
               </w:rPr>
-              <w:instrText xml:space="preserve"> PAGEREF _Toc213942511 \h </w:instrText>
+              <w:instrText xml:space="preserve"> PAGEREF _Toc214019508 \h </w:instrText>
             </w:r>
             <w:r>
               <w:rPr>
@@ -2957,7 +2955,7 @@
               <w:lang w:eastAsia="hu-HU"/>
             </w:rPr>
           </w:pPr>
-          <w:hyperlink w:anchor="_Toc213942512" w:history="1">
+          <w:hyperlink w:anchor="_Toc214019509" w:history="1">
             <w:r>
               <w:rPr>
                 <w:rStyle w:val="Hiperhivatkozs"/>
@@ -2984,7 +2982,7 @@
                 <w:noProof/>
                 <w:webHidden/>
               </w:rPr>
-              <w:instrText xml:space="preserve"> PAGEREF _Toc213942512 \h </w:instrText>
+              <w:instrText xml:space="preserve"> PAGEREF _Toc214019509 \h </w:instrText>
             </w:r>
             <w:r>
               <w:rPr>
@@ -3027,7 +3025,7 @@
               <w:lang w:eastAsia="hu-HU"/>
             </w:rPr>
           </w:pPr>
-          <w:hyperlink w:anchor="_Toc213942513" w:history="1">
+          <w:hyperlink w:anchor="_Toc214019510" w:history="1">
             <w:r>
               <w:rPr>
                 <w:rStyle w:val="Hiperhivatkozs"/>
@@ -3054,7 +3052,7 @@
                 <w:noProof/>
                 <w:webHidden/>
               </w:rPr>
-              <w:instrText xml:space="preserve"> PAGEREF _Toc213942513 \h </w:instrText>
+              <w:instrText xml:space="preserve"> PAGEREF _Toc214019510 \h </w:instrText>
             </w:r>
             <w:r>
               <w:rPr>
@@ -3099,7 +3097,7 @@
               <w:lang w:eastAsia="hu-HU"/>
             </w:rPr>
           </w:pPr>
-          <w:hyperlink w:anchor="_Toc213942514" w:history="1">
+          <w:hyperlink w:anchor="_Toc214019511" w:history="1">
             <w:r>
               <w:rPr>
                 <w:rStyle w:val="Hiperhivatkozs"/>
@@ -3126,7 +3124,7 @@
                 <w:noProof/>
                 <w:webHidden/>
               </w:rPr>
-              <w:instrText xml:space="preserve"> PAGEREF _Toc213942514 \h </w:instrText>
+              <w:instrText xml:space="preserve"> PAGEREF _Toc214019511 \h </w:instrText>
             </w:r>
             <w:r>
               <w:rPr>
@@ -3171,7 +3169,7 @@
               <w:lang w:eastAsia="hu-HU"/>
             </w:rPr>
           </w:pPr>
-          <w:hyperlink w:anchor="_Toc213942515" w:history="1">
+          <w:hyperlink w:anchor="_Toc214019512" w:history="1">
             <w:r>
               <w:rPr>
                 <w:rStyle w:val="Hiperhivatkozs"/>
@@ -3198,7 +3196,7 @@
                 <w:noProof/>
                 <w:webHidden/>
               </w:rPr>
-              <w:instrText xml:space="preserve"> PAGEREF _Toc213942515 \h </w:instrText>
+              <w:instrText xml:space="preserve"> PAGEREF _Toc214019512 \h </w:instrText>
             </w:r>
             <w:r>
               <w:rPr>
@@ -3243,7 +3241,7 @@
               <w:lang w:eastAsia="hu-HU"/>
             </w:rPr>
           </w:pPr>
-          <w:hyperlink w:anchor="_Toc213942516" w:history="1">
+          <w:hyperlink w:anchor="_Toc214019513" w:history="1">
             <w:r>
               <w:rPr>
                 <w:rStyle w:val="Hiperhivatkozs"/>
@@ -3270,7 +3268,7 @@
                 <w:noProof/>
                 <w:webHidden/>
               </w:rPr>
-              <w:instrText xml:space="preserve"> PAGEREF _Toc213942516 \h </w:instrText>
+              <w:instrText xml:space="preserve"> PAGEREF _Toc214019513 \h </w:instrText>
             </w:r>
             <w:r>
               <w:rPr>
@@ -3291,6 +3289,294 @@
                 <w:webHidden/>
               </w:rPr>
               <w:t>49</w:t>
+            </w:r>
+            <w:r>
+              <w:rPr>
+                <w:noProof/>
+                <w:webHidden/>
+              </w:rPr>
+              <w:fldChar w:fldCharType="end"/>
+            </w:r>
+          </w:hyperlink>
+        </w:p>
+        <w:p>
+          <w:pPr>
+            <w:pStyle w:val="TJ2"/>
+            <w:tabs>
+              <w:tab w:val="right" w:leader="dot" w:pos="8494"/>
+            </w:tabs>
+            <w:rPr>
+              <w:rFonts w:asciiTheme="minorHAnsi" w:eastAsiaTheme="minorEastAsia" w:hAnsiTheme="minorHAnsi" w:cstheme="minorBidi"/>
+              <w:noProof/>
+              <w:sz w:val="22"/>
+              <w:szCs w:val="22"/>
+              <w:lang w:eastAsia="hu-HU"/>
+            </w:rPr>
+          </w:pPr>
+          <w:hyperlink w:anchor="_Toc214019514" w:history="1">
+            <w:r>
+              <w:rPr>
+                <w:rStyle w:val="Hiperhivatkozs"/>
+                <w:noProof/>
+              </w:rPr>
+              <w:t>4.2 React Native</w:t>
+            </w:r>
+            <w:r>
+              <w:rPr>
+                <w:noProof/>
+                <w:webHidden/>
+              </w:rPr>
+              <w:tab/>
+            </w:r>
+            <w:r>
+              <w:rPr>
+                <w:noProof/>
+                <w:webHidden/>
+              </w:rPr>
+              <w:fldChar w:fldCharType="begin"/>
+            </w:r>
+            <w:r>
+              <w:rPr>
+                <w:noProof/>
+                <w:webHidden/>
+              </w:rPr>
+              <w:instrText xml:space="preserve"> PAGEREF _Toc214019514 \h </w:instrText>
+            </w:r>
+            <w:r>
+              <w:rPr>
+                <w:noProof/>
+                <w:webHidden/>
+              </w:rPr>
+            </w:r>
+            <w:r>
+              <w:rPr>
+                <w:noProof/>
+                <w:webHidden/>
+              </w:rPr>
+              <w:fldChar w:fldCharType="separate"/>
+            </w:r>
+            <w:r>
+              <w:rPr>
+                <w:noProof/>
+                <w:webHidden/>
+              </w:rPr>
+              <w:t>53</w:t>
+            </w:r>
+            <w:r>
+              <w:rPr>
+                <w:noProof/>
+                <w:webHidden/>
+              </w:rPr>
+              <w:fldChar w:fldCharType="end"/>
+            </w:r>
+          </w:hyperlink>
+        </w:p>
+        <w:p>
+          <w:pPr>
+            <w:pStyle w:val="TJ3"/>
+            <w:tabs>
+              <w:tab w:val="right" w:leader="dot" w:pos="8494"/>
+            </w:tabs>
+            <w:rPr>
+              <w:rFonts w:asciiTheme="minorHAnsi" w:eastAsiaTheme="minorEastAsia" w:hAnsiTheme="minorHAnsi" w:cstheme="minorBidi"/>
+              <w:noProof/>
+              <w:sz w:val="22"/>
+              <w:szCs w:val="22"/>
+              <w:lang w:eastAsia="hu-HU"/>
+            </w:rPr>
+          </w:pPr>
+          <w:hyperlink w:anchor="_Toc214019515" w:history="1">
+            <w:r>
+              <w:rPr>
+                <w:rStyle w:val="Hiperhivatkozs"/>
+                <w:noProof/>
+              </w:rPr>
+              <w:t>4.2.1 Expo app.json</w:t>
+            </w:r>
+            <w:r>
+              <w:rPr>
+                <w:noProof/>
+                <w:webHidden/>
+              </w:rPr>
+              <w:tab/>
+            </w:r>
+            <w:r>
+              <w:rPr>
+                <w:noProof/>
+                <w:webHidden/>
+              </w:rPr>
+              <w:fldChar w:fldCharType="begin"/>
+            </w:r>
+            <w:r>
+              <w:rPr>
+                <w:noProof/>
+                <w:webHidden/>
+              </w:rPr>
+              <w:instrText xml:space="preserve"> PAGEREF _Toc214019515 \h </w:instrText>
+            </w:r>
+            <w:r>
+              <w:rPr>
+                <w:noProof/>
+                <w:webHidden/>
+              </w:rPr>
+            </w:r>
+            <w:r>
+              <w:rPr>
+                <w:noProof/>
+                <w:webHidden/>
+              </w:rPr>
+              <w:fldChar w:fldCharType="separate"/>
+            </w:r>
+            <w:r>
+              <w:rPr>
+                <w:noProof/>
+                <w:webHidden/>
+              </w:rPr>
+              <w:t>53</w:t>
+            </w:r>
+            <w:r>
+              <w:rPr>
+                <w:noProof/>
+                <w:webHidden/>
+              </w:rPr>
+              <w:fldChar w:fldCharType="end"/>
+            </w:r>
+          </w:hyperlink>
+        </w:p>
+        <w:p>
+          <w:pPr>
+            <w:pStyle w:val="TJ3"/>
+            <w:tabs>
+              <w:tab w:val="right" w:leader="dot" w:pos="8494"/>
+            </w:tabs>
+            <w:rPr>
+              <w:rFonts w:asciiTheme="minorHAnsi" w:eastAsiaTheme="minorEastAsia" w:hAnsiTheme="minorHAnsi" w:cstheme="minorBidi"/>
+              <w:noProof/>
+              <w:sz w:val="22"/>
+              <w:szCs w:val="22"/>
+              <w:lang w:eastAsia="hu-HU"/>
+            </w:rPr>
+          </w:pPr>
+          <w:hyperlink w:anchor="_Toc214019516" w:history="1">
+            <w:r>
+              <w:rPr>
+                <w:rStyle w:val="Hiperhivatkozs"/>
+                <w:noProof/>
+              </w:rPr>
+              <w:t>4.2.2 Expo router</w:t>
+            </w:r>
+            <w:r>
+              <w:rPr>
+                <w:noProof/>
+                <w:webHidden/>
+              </w:rPr>
+              <w:tab/>
+            </w:r>
+            <w:r>
+              <w:rPr>
+                <w:noProof/>
+                <w:webHidden/>
+              </w:rPr>
+              <w:fldChar w:fldCharType="begin"/>
+            </w:r>
+            <w:r>
+              <w:rPr>
+                <w:noProof/>
+                <w:webHidden/>
+              </w:rPr>
+              <w:instrText xml:space="preserve"> PAGEREF _Toc214019516 \h </w:instrText>
+            </w:r>
+            <w:r>
+              <w:rPr>
+                <w:noProof/>
+                <w:webHidden/>
+              </w:rPr>
+            </w:r>
+            <w:r>
+              <w:rPr>
+                <w:noProof/>
+                <w:webHidden/>
+              </w:rPr>
+              <w:fldChar w:fldCharType="separate"/>
+            </w:r>
+            <w:r>
+              <w:rPr>
+                <w:noProof/>
+                <w:webHidden/>
+              </w:rPr>
+              <w:t>55</w:t>
+            </w:r>
+            <w:r>
+              <w:rPr>
+                <w:noProof/>
+                <w:webHidden/>
+              </w:rPr>
+              <w:fldChar w:fldCharType="end"/>
+            </w:r>
+          </w:hyperlink>
+        </w:p>
+        <w:p>
+          <w:pPr>
+            <w:pStyle w:val="TJ3"/>
+            <w:tabs>
+              <w:tab w:val="right" w:leader="dot" w:pos="8494"/>
+            </w:tabs>
+            <w:rPr>
+              <w:rFonts w:asciiTheme="minorHAnsi" w:eastAsiaTheme="minorEastAsia" w:hAnsiTheme="minorHAnsi" w:cstheme="minorBidi"/>
+              <w:noProof/>
+              <w:sz w:val="22"/>
+              <w:szCs w:val="22"/>
+              <w:lang w:eastAsia="hu-HU"/>
+            </w:rPr>
+          </w:pPr>
+          <w:hyperlink w:anchor="_Toc214019517" w:history="1">
+            <w:r>
+              <w:rPr>
+                <w:rStyle w:val="Hiperhivatkozs"/>
+                <w:noProof/>
+              </w:rPr>
+              <w:t>4.2.3 Zustand global store</w:t>
+            </w:r>
+            <w:r>
+              <w:rPr>
+                <w:noProof/>
+                <w:webHidden/>
+              </w:rPr>
+              <w:tab/>
+            </w:r>
+            <w:r>
+              <w:rPr>
+                <w:noProof/>
+                <w:webHidden/>
+              </w:rPr>
+              <w:fldChar w:fldCharType="begin"/>
+            </w:r>
+            <w:r>
+              <w:rPr>
+                <w:noProof/>
+                <w:webHidden/>
+              </w:rPr>
+              <w:instrText xml:space="preserve"> PAGEREF _Toc214019517 \h </w:instrText>
+            </w:r>
+            <w:r>
+              <w:rPr>
+                <w:noProof/>
+                <w:webHidden/>
+              </w:rPr>
+            </w:r>
+            <w:r>
+              <w:rPr>
+                <w:noProof/>
+                <w:webHidden/>
+              </w:rPr>
+              <w:fldChar w:fldCharType="separate"/>
+            </w:r>
+            <w:r>
+              <w:rPr>
+                <w:noProof/>
+                <w:webHidden/>
+              </w:rPr>
+              <w:t>56</w:t>
             </w:r>
             <w:r>
               <w:rPr>
@@ -3313,7 +3599,7 @@
               <w:lang w:eastAsia="hu-HU"/>
             </w:rPr>
           </w:pPr>
-          <w:hyperlink w:anchor="_Toc213942517" w:history="1">
+          <w:hyperlink w:anchor="_Toc214019518" w:history="1">
             <w:r>
               <w:rPr>
                 <w:rStyle w:val="Hiperhivatkozs"/>
@@ -3340,7 +3626,7 @@
                 <w:noProof/>
                 <w:webHidden/>
               </w:rPr>
-              <w:instrText xml:space="preserve"> PAGEREF _Toc213942517 \h </w:instrText>
+              <w:instrText xml:space="preserve"> PAGEREF _Toc214019518 \h </w:instrText>
             </w:r>
             <w:r>
               <w:rPr>
@@ -3360,7 +3646,7 @@
                 <w:noProof/>
                 <w:webHidden/>
               </w:rPr>
-              <w:t>54</w:t>
+              <w:t>58</w:t>
             </w:r>
             <w:r>
               <w:rPr>
@@ -3383,7 +3669,7 @@
               <w:lang w:eastAsia="hu-HU"/>
             </w:rPr>
           </w:pPr>
-          <w:hyperlink w:anchor="_Toc213942518" w:history="1">
+          <w:hyperlink w:anchor="_Toc214019519" w:history="1">
             <w:r>
               <w:rPr>
                 <w:rStyle w:val="Hiperhivatkozs"/>
@@ -3410,7 +3696,7 @@
                 <w:noProof/>
                 <w:webHidden/>
               </w:rPr>
-              <w:instrText xml:space="preserve"> PAGEREF _Toc213942518 \h </w:instrText>
+              <w:instrText xml:space="preserve"> PAGEREF _Toc214019519 \h </w:instrText>
             </w:r>
             <w:r>
               <w:rPr>
@@ -3430,7 +3716,7 @@
                 <w:noProof/>
                 <w:webHidden/>
               </w:rPr>
-              <w:t>55</w:t>
+              <w:t>59</w:t>
             </w:r>
             <w:r>
               <w:rPr>
@@ -3453,7 +3739,7 @@
               <w:lang w:eastAsia="hu-HU"/>
             </w:rPr>
           </w:pPr>
-          <w:hyperlink w:anchor="_Toc213942519" w:history="1">
+          <w:hyperlink w:anchor="_Toc214019520" w:history="1">
             <w:r>
               <w:rPr>
                 <w:rStyle w:val="Hiperhivatkozs"/>
@@ -3480,7 +3766,7 @@
                 <w:noProof/>
                 <w:webHidden/>
               </w:rPr>
-              <w:instrText xml:space="preserve"> PAGEREF _Toc213942519 \h </w:instrText>
+              <w:instrText xml:space="preserve"> PAGEREF _Toc214019520 \h </w:instrText>
             </w:r>
             <w:r>
               <w:rPr>
@@ -3500,7 +3786,7 @@
                 <w:noProof/>
                 <w:webHidden/>
               </w:rPr>
-              <w:t>56</w:t>
+              <w:t>60</w:t>
             </w:r>
             <w:r>
               <w:rPr>
@@ -3523,7 +3809,7 @@
               <w:lang w:eastAsia="hu-HU"/>
             </w:rPr>
           </w:pPr>
-          <w:hyperlink w:anchor="_Toc213942520" w:history="1">
+          <w:hyperlink w:anchor="_Toc214019521" w:history="1">
             <w:r>
               <w:rPr>
                 <w:rStyle w:val="Hiperhivatkozs"/>
@@ -3550,7 +3836,7 @@
                 <w:noProof/>
                 <w:webHidden/>
               </w:rPr>
-              <w:instrText xml:space="preserve"> PAGEREF _Toc213942520 \h </w:instrText>
+              <w:instrText xml:space="preserve"> PAGEREF _Toc214019521 \h </w:instrText>
             </w:r>
             <w:r>
               <w:rPr>
@@ -3570,7 +3856,7 @@
                 <w:noProof/>
                 <w:webHidden/>
               </w:rPr>
-              <w:t>58</w:t>
+              <w:t>62</w:t>
             </w:r>
             <w:r>
               <w:rPr>
@@ -3593,7 +3879,7 @@
               <w:lang w:eastAsia="hu-HU"/>
             </w:rPr>
           </w:pPr>
-          <w:hyperlink w:anchor="_Toc213942521" w:history="1">
+          <w:hyperlink w:anchor="_Toc214019522" w:history="1">
             <w:r>
               <w:rPr>
                 <w:rStyle w:val="Hiperhivatkozs"/>
@@ -3620,7 +3906,7 @@
                 <w:noProof/>
                 <w:webHidden/>
               </w:rPr>
-              <w:instrText xml:space="preserve"> PAGEREF _Toc213942521 \h </w:instrText>
+              <w:instrText xml:space="preserve"> PAGEREF _Toc214019522 \h </w:instrText>
             </w:r>
             <w:r>
               <w:rPr>
@@ -3640,7 +3926,7 @@
                 <w:noProof/>
                 <w:webHidden/>
               </w:rPr>
-              <w:t>59</w:t>
+              <w:t>63</w:t>
             </w:r>
             <w:r>
               <w:rPr>
@@ -3746,7 +4032,7 @@
       <w:r>
         <w:t xml:space="preserve">Kelt: Budapest, </w:t>
       </w:r>
-      <w:commentRangeStart w:id="3"/>
+      <w:commentRangeStart w:id="2"/>
       <w:r>
         <w:t>20</w:t>
       </w:r>
@@ -3756,12 +4042,12 @@
       <w:r>
         <w:t>5. 10. 19</w:t>
       </w:r>
-      <w:commentRangeEnd w:id="3"/>
+      <w:commentRangeEnd w:id="2"/>
       <w:r>
         <w:rPr>
           <w:rStyle w:val="Jegyzethivatkozs"/>
         </w:rPr>
-        <w:commentReference w:id="3"/>
+        <w:commentReference w:id="2"/>
       </w:r>
     </w:p>
     <w:p>
@@ -3812,22 +4098,36 @@
       <w:pPr>
         <w:pStyle w:val="Fejezetcimszmozsnlkl"/>
       </w:pPr>
-      <w:bookmarkStart w:id="4" w:name="_Toc206593386"/>
-      <w:bookmarkStart w:id="5" w:name="_Toc213942476"/>
+      <w:bookmarkStart w:id="3" w:name="_Toc206593386"/>
+      <w:bookmarkStart w:id="4" w:name="_Toc214019473"/>
       <w:r>
         <w:lastRenderedPageBreak/>
         <w:t>Összefoglaló</w:t>
       </w:r>
+      <w:bookmarkEnd w:id="3"/>
       <w:bookmarkEnd w:id="4"/>
-      <w:bookmarkEnd w:id="5"/>
-    </w:p>
-    <w:p>
+    </w:p>
+    <w:p>
+      <w:commentRangeStart w:id="5"/>
+      <w:r>
+        <w:t xml:space="preserve">A szakdolgozat, vagy diplomaterv elkészítése minden egyetemi hallgató életében egy fontos mérföldkő. Lehetőséget ad arra, hogy az egyetemi évei során megtanultakat kamatoztassa és eredményeit szélesebb közönség előtt bemutassa, s mérnöki rátermettségét bizonyítsa. </w:t>
+      </w:r>
+      <w:r>
+        <w:t>Fontos azonban, hogy a dolgozat elkészítésének folyamata számos csapdát is rejt magában</w:t>
+      </w:r>
+      <w:commentRangeEnd w:id="5"/>
+      <w:r>
+        <w:rPr>
+          <w:rStyle w:val="Jegyzethivatkozs"/>
+        </w:rPr>
+        <w:commentReference w:id="5"/>
+      </w:r>
+      <w:r>
+        <w:t xml:space="preserve">. </w:t>
+      </w:r>
       <w:commentRangeStart w:id="6"/>
       <w:r>
-        <w:t xml:space="preserve">A szakdolgozat, vagy diplomaterv elkészítése minden egyetemi hallgató életében egy fontos mérföldkő. Lehetőséget ad arra, hogy az egyetemi évei során megtanultakat kamatoztassa és eredményeit szélesebb közönség előtt bemutassa, s mérnöki rátermettségét bizonyítsa. </w:t>
-      </w:r>
-      <w:r>
-        <w:t>Fontos azonban, hogy a dolgozat elkészítésének folyamata számos csapdát is rejt magában</w:t>
+        <w:t xml:space="preserve">Rossz időgazdálkodás, hiányos szövegszerkesztési ismeretek, illetve a dolgozat készítéséhez nélkülözhetetlen „műfaji” szabályok ismeretének hiánya könnyen oda vezethetnek, hogy egy egyébként jelentős időbefektetéssel készült kiemelkedő szoftver is csak gyengébb minősítést kapjon a gyenge minőségű dolgozat miatt. </w:t>
       </w:r>
       <w:commentRangeEnd w:id="6"/>
       <w:r>
@@ -3836,12 +4136,14 @@
         </w:rPr>
         <w:commentReference w:id="6"/>
       </w:r>
-      <w:r>
-        <w:t xml:space="preserve">. </w:t>
-      </w:r>
+    </w:p>
+    <w:p>
       <w:commentRangeStart w:id="7"/>
       <w:r>
-        <w:t xml:space="preserve">Rossz időgazdálkodás, hiányos szövegszerkesztési ismeretek, illetve a dolgozat készítéséhez nélkülözhetetlen „műfaji” szabályok ismeretének hiánya könnyen oda vezethetnek, hogy egy egyébként jelentős időbefektetéssel készült kiemelkedő szoftver is csak gyengébb minősítést kapjon a gyenge minőségű dolgozat miatt. </w:t>
+        <w:t xml:space="preserve">E dokumentum – amellett, hogy egy általános szerkesztési keretet ad a dolgozatodnak – összefoglalja a szakdolgozat/diplomaterv írás írott és íratlan szabályait. Összeszedjük a Word kezelésének legfontosabb részeit (címsorok, ábrák, irodalomjegyzék stb.), a dolgozat felépítésének általános tartalmi és szerkezeti irányelveit. </w:t>
+      </w:r>
+      <w:r>
+        <w:t>Bár mindenkire igazítható sablon természetesen nem létezik, megadjuk azokat az általános arányokat, oldalszámokat</w:t>
       </w:r>
       <w:commentRangeEnd w:id="7"/>
       <w:r>
@@ -3850,14 +4152,12 @@
         </w:rPr>
         <w:commentReference w:id="7"/>
       </w:r>
-    </w:p>
-    <w:p>
+      <w:r>
+        <w:t>,</w:t>
+      </w:r>
       <w:commentRangeStart w:id="8"/>
       <w:r>
-        <w:t xml:space="preserve">E dokumentum – amellett, hogy egy általános szerkesztési keretet ad a dolgozatodnak – összefoglalja a szakdolgozat/diplomaterv írás írott és íratlan szabályait. Összeszedjük a Word kezelésének legfontosabb részeit (címsorok, ábrák, irodalomjegyzék stb.), a dolgozat felépítésének általános tartalmi és szerkezeti irányelveit. </w:t>
-      </w:r>
-      <w:r>
-        <w:t>Bár mindenkire igazítható sablon természetesen nem létezik, megadjuk azokat az általános arányokat, oldalszámokat</w:t>
+        <w:t xml:space="preserve"> amelyek betartásával jó eséllyel készíthetsz egy színvonalas dolgozatot. A részletes és pontokba szedett elvárás-lista nem csupán a dolgozat írásakor, de akár más dolgozatok értékelésekor is kiváló támpontként szolgálhat.</w:t>
       </w:r>
       <w:commentRangeEnd w:id="8"/>
       <w:r>
@@ -3866,12 +4166,11 @@
         </w:rPr>
         <w:commentReference w:id="8"/>
       </w:r>
-      <w:r>
-        <w:t>,</w:t>
-      </w:r>
+    </w:p>
+    <w:p>
       <w:commentRangeStart w:id="9"/>
       <w:r>
-        <w:t xml:space="preserve"> amelyek betartásával jó eséllyel készíthetsz egy színvonalas dolgozatot. A részletes és pontokba szedett elvárás-lista nem csupán a dolgozat írásakor, de akár más dolgozatok értékelésekor is kiváló támpontként szolgálhat.</w:t>
+        <w:t>Az itt átadott ismeretek és szemléletmód nem csupán az aktuális feladatod leküzdésében segíthet, de hosszútávon is számos praktikus fogással bővítheti a szövegszerkesztési és dokumentumkészítési eszköztáradat.</w:t>
       </w:r>
       <w:commentRangeEnd w:id="9"/>
       <w:r>
@@ -3882,30 +4181,17 @@
       </w:r>
     </w:p>
     <w:p>
-      <w:commentRangeStart w:id="10"/>
-      <w:r>
-        <w:t>Az itt átadott ismeretek és szemléletmód nem csupán az aktuális feladatod leküzdésében segíthet, de hosszútávon is számos praktikus fogással bővítheti a szövegszerkesztési és dokumentumkészítési eszköztáradat.</w:t>
-      </w:r>
-      <w:commentRangeEnd w:id="10"/>
-      <w:r>
-        <w:rPr>
-          <w:rStyle w:val="Jegyzethivatkozs"/>
-        </w:rPr>
-        <w:commentReference w:id="10"/>
-      </w:r>
-    </w:p>
-    <w:p>
       <w:pPr>
         <w:pStyle w:val="Fejezetcimszmozsnlkl"/>
       </w:pPr>
-      <w:bookmarkStart w:id="11" w:name="_Toc206593387"/>
-      <w:bookmarkStart w:id="12" w:name="_Toc213942477"/>
+      <w:bookmarkStart w:id="10" w:name="_Toc206593387"/>
+      <w:bookmarkStart w:id="11" w:name="_Toc214019474"/>
       <w:r>
         <w:lastRenderedPageBreak/>
         <w:t>Abstract</w:t>
       </w:r>
+      <w:bookmarkEnd w:id="10"/>
       <w:bookmarkEnd w:id="11"/>
-      <w:bookmarkEnd w:id="12"/>
     </w:p>
     <w:p>
       <w:r>
@@ -3940,26 +4226,26 @@
       <w:pPr>
         <w:pStyle w:val="Cmsor1"/>
       </w:pPr>
-      <w:bookmarkStart w:id="13" w:name="_Toc332797397"/>
-      <w:bookmarkStart w:id="14" w:name="_Toc206593388"/>
-      <w:bookmarkStart w:id="15" w:name="_Toc213942478"/>
+      <w:bookmarkStart w:id="12" w:name="_Toc332797397"/>
+      <w:bookmarkStart w:id="13" w:name="_Toc206593388"/>
+      <w:bookmarkStart w:id="14" w:name="_Toc214019475"/>
       <w:r>
         <w:lastRenderedPageBreak/>
         <w:t>Bevezetés</w:t>
       </w:r>
+      <w:bookmarkEnd w:id="12"/>
       <w:bookmarkEnd w:id="13"/>
       <w:bookmarkEnd w:id="14"/>
+    </w:p>
+    <w:p>
+      <w:pPr>
+        <w:pStyle w:val="Cmsor2"/>
+      </w:pPr>
+      <w:bookmarkStart w:id="15" w:name="_Toc214019476"/>
+      <w:r>
+        <w:t>Motiváció</w:t>
+      </w:r>
       <w:bookmarkEnd w:id="15"/>
-    </w:p>
-    <w:p>
-      <w:pPr>
-        <w:pStyle w:val="Cmsor2"/>
-      </w:pPr>
-      <w:bookmarkStart w:id="16" w:name="_Toc213942479"/>
-      <w:r>
-        <w:t>Motiváció</w:t>
-      </w:r>
-      <w:bookmarkEnd w:id="16"/>
     </w:p>
     <w:p>
       <w:r>
@@ -4237,22 +4523,22 @@
       <w:pPr>
         <w:pStyle w:val="Cmsor2"/>
       </w:pPr>
-      <w:bookmarkStart w:id="17" w:name="_Toc213942480"/>
+      <w:bookmarkStart w:id="16" w:name="_Toc214019477"/>
       <w:r>
         <w:lastRenderedPageBreak/>
         <w:t>Az alkalmazás felhasználói nézőpontból</w:t>
       </w:r>
+      <w:bookmarkEnd w:id="16"/>
+    </w:p>
+    <w:p>
+      <w:pPr>
+        <w:pStyle w:val="Cmsor3"/>
+      </w:pPr>
+      <w:bookmarkStart w:id="17" w:name="_Toc214019478"/>
+      <w:r>
+        <w:t>Név és ikon</w:t>
+      </w:r>
       <w:bookmarkEnd w:id="17"/>
-    </w:p>
-    <w:p>
-      <w:pPr>
-        <w:pStyle w:val="Cmsor3"/>
-      </w:pPr>
-      <w:bookmarkStart w:id="18" w:name="_Toc213942481"/>
-      <w:r>
-        <w:t>Név és ikon</w:t>
-      </w:r>
-      <w:bookmarkEnd w:id="18"/>
     </w:p>
     <w:p>
       <w:pPr>
@@ -4307,7 +4593,7 @@
         </w:drawing>
       </w:r>
     </w:p>
-    <w:bookmarkStart w:id="19" w:name="_Ref213836363"/>
+    <w:bookmarkStart w:id="18" w:name="_Ref213836363"/>
     <w:p>
       <w:pPr>
         <w:pStyle w:val="Kpalrs"/>
@@ -4333,61 +4619,61 @@
       <w:r>
         <w:t>. ábra</w:t>
       </w:r>
+      <w:bookmarkEnd w:id="18"/>
+      <w:r>
+        <w:t xml:space="preserve"> Az alkalmazás parancsikonja</w:t>
+      </w:r>
+    </w:p>
+    <w:p>
+      <w:r>
+        <w:t xml:space="preserve">Az alkalmazás a </w:t>
+      </w:r>
+      <w:r>
+        <w:rPr>
+          <w:i/>
+        </w:rPr>
+        <w:t>Coffer</w:t>
+      </w:r>
+      <w:r>
+        <w:t xml:space="preserve"> nevet kapta, amely a „kincsesláda” angol, kissé egzotikusabb kifejezése. Azért ezt a nevet választottam, mert a kincsesláda szimbolizálja azt a helyet, ahová a felhasználó mindent elhelyez, amit nagy becsben tart – és mi lehetne értékesebb, mint a saját gyűjteménye. Emellett a kincsesláda tágas, így utal arra is, hogy az alkalmazásban számos különféle gyűjtemény elfér. </w:t>
+      </w:r>
+      <w:r>
+        <w:t xml:space="preserve">Az alkalmazás ikonját az </w:t>
+      </w:r>
+      <w:r>
+        <w:fldChar w:fldCharType="begin"/>
+      </w:r>
+      <w:r>
+        <w:instrText xml:space="preserve"> REF _Ref213836363 \h </w:instrText>
+      </w:r>
+      <w:r>
+        <w:fldChar w:fldCharType="separate"/>
+      </w:r>
+      <w:r>
+        <w:rPr>
+          <w:noProof/>
+        </w:rPr>
+        <w:t>1</w:t>
+      </w:r>
+      <w:r>
+        <w:t>. ábra</w:t>
+      </w:r>
+      <w:r>
+        <w:fldChar w:fldCharType="end"/>
+      </w:r>
+      <w:r>
+        <w:t xml:space="preserve"> szemlélteti; ez vizuálisan reprezentálja a kincsesládában őrzött, nagy becsben tartott értékeket.</w:t>
+      </w:r>
+    </w:p>
+    <w:p>
+      <w:pPr>
+        <w:pStyle w:val="Cmsor3"/>
+      </w:pPr>
+      <w:bookmarkStart w:id="19" w:name="_Toc214019479"/>
+      <w:r>
+        <w:t>Felhasználói funkciók</w:t>
+      </w:r>
       <w:bookmarkEnd w:id="19"/>
-      <w:r>
-        <w:t xml:space="preserve"> Az alkalmazás parancsikonja</w:t>
-      </w:r>
-    </w:p>
-    <w:p>
-      <w:r>
-        <w:t xml:space="preserve">Az alkalmazás a </w:t>
-      </w:r>
-      <w:r>
-        <w:rPr>
-          <w:i/>
-        </w:rPr>
-        <w:t>Coffer</w:t>
-      </w:r>
-      <w:r>
-        <w:t xml:space="preserve"> nevet kapta, amely a „kincsesláda” angol, kissé egzotikusabb kifejezése. Azért ezt a nevet választottam, mert a kincsesláda szimbolizálja azt a helyet, ahová a felhasználó mindent elhelyez, amit nagy becsben tart – és mi lehetne értékesebb, mint a saját gyűjteménye. Emellett a kincsesláda tágas, így utal arra is, hogy az alkalmazásban számos különféle gyűjtemény elfér. </w:t>
-      </w:r>
-      <w:r>
-        <w:t xml:space="preserve">Az alkalmazás ikonját az </w:t>
-      </w:r>
-      <w:r>
-        <w:fldChar w:fldCharType="begin"/>
-      </w:r>
-      <w:r>
-        <w:instrText xml:space="preserve"> REF _Ref213836363 \h </w:instrText>
-      </w:r>
-      <w:r>
-        <w:fldChar w:fldCharType="separate"/>
-      </w:r>
-      <w:r>
-        <w:rPr>
-          <w:noProof/>
-        </w:rPr>
-        <w:t>1</w:t>
-      </w:r>
-      <w:r>
-        <w:t>. ábra</w:t>
-      </w:r>
-      <w:r>
-        <w:fldChar w:fldCharType="end"/>
-      </w:r>
-      <w:r>
-        <w:t xml:space="preserve"> szemlélteti; ez vizuálisan reprezentálja a kincsesládában őrzött, nagy becsben tartott értékeket.</w:t>
-      </w:r>
-    </w:p>
-    <w:p>
-      <w:pPr>
-        <w:pStyle w:val="Cmsor3"/>
-      </w:pPr>
-      <w:bookmarkStart w:id="20" w:name="_Toc213942482"/>
-      <w:r>
-        <w:t>Felhasználói funkciók</w:t>
-      </w:r>
-      <w:bookmarkEnd w:id="20"/>
     </w:p>
     <w:p>
       <w:r>
@@ -4481,7 +4767,7 @@
           <w:numId w:val="37"/>
         </w:numPr>
       </w:pPr>
-      <w:bookmarkStart w:id="21" w:name="feed"/>
+      <w:bookmarkStart w:id="20" w:name="feed"/>
       <w:r>
         <w:rPr>
           <w:i/>
@@ -4491,7 +4777,7 @@
       <w:r>
         <w:t>:</w:t>
       </w:r>
-      <w:bookmarkEnd w:id="21"/>
+      <w:bookmarkEnd w:id="20"/>
       <w:r>
         <w:t xml:space="preserve"> </w:t>
       </w:r>
@@ -4667,7 +4953,7 @@
           <w:numId w:val="37"/>
         </w:numPr>
       </w:pPr>
-      <w:bookmarkStart w:id="22" w:name="tradedetails"/>
+      <w:bookmarkStart w:id="21" w:name="tradedetails"/>
       <w:r>
         <w:rPr>
           <w:i/>
@@ -4677,7 +4963,7 @@
       <w:r>
         <w:t>:</w:t>
       </w:r>
-      <w:bookmarkEnd w:id="22"/>
+      <w:bookmarkEnd w:id="21"/>
       <w:r>
         <w:t xml:space="preserve"> </w:t>
       </w:r>
@@ -5126,8 +5412,8 @@
       <w:pPr>
         <w:pStyle w:val="Cmsor1"/>
       </w:pPr>
-      <w:bookmarkStart w:id="23" w:name="_Toc213942483"/>
-      <w:bookmarkStart w:id="24" w:name="_Toc332797398"/>
+      <w:bookmarkStart w:id="22" w:name="_Toc332797398"/>
+      <w:bookmarkStart w:id="23" w:name="_Toc214019480"/>
       <w:r>
         <w:lastRenderedPageBreak/>
         <w:t>Alkalmazott technológiák</w:t>
@@ -5138,43 +5424,43 @@
       <w:pPr>
         <w:pStyle w:val="Cmsor2"/>
       </w:pPr>
-      <w:bookmarkStart w:id="25" w:name="_Toc213942484"/>
+      <w:bookmarkStart w:id="24" w:name="_Toc214019481"/>
       <w:r>
         <w:t>PostgreSQL</w:t>
       </w:r>
+      <w:bookmarkEnd w:id="24"/>
+    </w:p>
+    <w:p>
+      <w:r>
+        <w:t>Minden alkalmazás alapját egy adatbázis képezi, ahova a felhasználók által generált adatok menthetők. Az adatbázisoknak számos követelménynek kell megfelelniük: biztosítaniuk kell az adatbiztonságot és az adatvédelmet, hibamentesen kell működniük, valamint támogatniuk kell a többfelhasználós környezetet.</w:t>
+      </w:r>
+    </w:p>
+    <w:p>
+      <w:r>
+        <w:t xml:space="preserve">Napjainkban rengeteg </w:t>
+      </w:r>
+      <w:r>
+        <w:t xml:space="preserve">lehetőség közül választhatunk - </w:t>
+      </w:r>
+      <w:r>
+        <w:t>léteznek relációs és NoSQL adatbázisok is. Bár a NoSQL megoldások egyre nagyobb népszerűségnek örvendenek, én a relációs adatbázis mellett döntöttem, mivel főként ehhez tanultam meg az adatstruktúra-tervezés alapjait. A relációs adatbázisok nagy része hasonló elven működik, csak kisebb külö</w:t>
+      </w:r>
+      <w:r>
+        <w:t>nbségek figyelhetők meg köztük -</w:t>
+      </w:r>
+      <w:r>
+        <w:t xml:space="preserve"> például bizonyos SQL-funkciók elérhetőségében. A választást általában nem ezek a különbségek, hanem sokkal inkább a fejlesztői tapasztalat, a használt eszközök ismerete, illetve a projektbe illeszthetőség határozza meg. Én is ezen a szemléleten haladtam, és azt a megoldást választottam, amellyel korábban már dolgoztam: így az adatbázisom PostgreSQL alapokon fut.</w:t>
+      </w:r>
+    </w:p>
+    <w:p>
+      <w:pPr>
+        <w:pStyle w:val="Cmsor2"/>
+      </w:pPr>
+      <w:bookmarkStart w:id="25" w:name="_Toc214019482"/>
+      <w:r>
+        <w:t>ASP.NET Core (backend)</w:t>
+      </w:r>
       <w:bookmarkEnd w:id="25"/>
-    </w:p>
-    <w:p>
-      <w:r>
-        <w:t>Minden alkalmazás alapját egy adatbázis képezi, ahova a felhasználók által generált adatok menthetők. Az adatbázisoknak számos követelménynek kell megfelelniük: biztosítaniuk kell az adatbiztonságot és az adatvédelmet, hibamentesen kell működniük, valamint támogatniuk kell a többfelhasználós környezetet.</w:t>
-      </w:r>
-    </w:p>
-    <w:p>
-      <w:r>
-        <w:t xml:space="preserve">Napjainkban rengeteg </w:t>
-      </w:r>
-      <w:r>
-        <w:t xml:space="preserve">lehetőség közül választhatunk - </w:t>
-      </w:r>
-      <w:r>
-        <w:t>léteznek relációs és NoSQL adatbázisok is. Bár a NoSQL megoldások egyre nagyobb népszerűségnek örvendenek, én a relációs adatbázis mellett döntöttem, mivel főként ehhez tanultam meg az adatstruktúra-tervezés alapjait. A relációs adatbázisok nagy része hasonló elven működik, csak kisebb külö</w:t>
-      </w:r>
-      <w:r>
-        <w:t>nbségek figyelhetők meg köztük -</w:t>
-      </w:r>
-      <w:r>
-        <w:t xml:space="preserve"> például bizonyos SQL-funkciók elérhetőségében. A választást általában nem ezek a különbségek, hanem sokkal inkább a fejlesztői tapasztalat, a használt eszközök ismerete, illetve a projektbe illeszthetőség határozza meg. Én is ezen a szemléleten haladtam, és azt a megoldást választottam, amellyel korábban már dolgoztam: így az adatbázisom PostgreSQL alapokon fut.</w:t>
-      </w:r>
-    </w:p>
-    <w:p>
-      <w:pPr>
-        <w:pStyle w:val="Cmsor2"/>
-      </w:pPr>
-      <w:bookmarkStart w:id="26" w:name="_Toc213942485"/>
-      <w:r>
-        <w:t>ASP.NET Core (backend)</w:t>
-      </w:r>
-      <w:bookmarkEnd w:id="26"/>
     </w:p>
     <w:p>
       <w:r>
@@ -5233,14 +5519,14 @@
       <w:pPr>
         <w:pStyle w:val="Cmsor3"/>
       </w:pPr>
-      <w:bookmarkStart w:id="27" w:name="_Web_API"/>
-      <w:bookmarkStart w:id="28" w:name="_Toc213942486"/>
-      <w:bookmarkEnd w:id="27"/>
+      <w:bookmarkStart w:id="26" w:name="_Web_API"/>
+      <w:bookmarkStart w:id="27" w:name="_Toc214019483"/>
+      <w:bookmarkEnd w:id="26"/>
       <w:r>
         <w:lastRenderedPageBreak/>
         <w:t>Web API</w:t>
       </w:r>
-      <w:bookmarkEnd w:id="28"/>
+      <w:bookmarkEnd w:id="27"/>
     </w:p>
     <w:p>
       <w:r>
@@ -5296,7 +5582,7 @@
                       </wps:spPr>
                       <wps:txbx>
                         <w:txbxContent>
-                          <w:bookmarkStart w:id="29" w:name="_Ref213402956"/>
+                          <w:bookmarkStart w:id="28" w:name="_Ref213402956"/>
                           <w:p>
                             <w:pPr>
                               <w:pStyle w:val="Kpalrs"/>
@@ -5339,7 +5625,7 @@
                             <w:r>
                               <w:t>. ábra</w:t>
                             </w:r>
-                            <w:bookmarkEnd w:id="29"/>
+                            <w:bookmarkEnd w:id="28"/>
                             <w:r>
                               <w:t xml:space="preserve"> Tipikus ASP.NET Core Web Api design</w:t>
                             </w:r>
@@ -5394,7 +5680,7 @@
               <v:shape id="Szövegdoboz 5" o:spid="_x0000_s1026" type="#_x0000_t202" style="position:absolute;left:0;text-align:left;margin-left:71.2pt;margin-top:207.75pt;width:282.75pt;height:.05pt;z-index:251662336;visibility:visible;mso-wrap-style:square;mso-wrap-distance-left:9pt;mso-wrap-distance-top:0;mso-wrap-distance-right:9pt;mso-wrap-distance-bottom:0;mso-position-horizontal:absolute;mso-position-horizontal-relative:text;mso-position-vertical:absolute;mso-position-vertical-relative:text;v-text-anchor:top" o:gfxdata="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" stroked="f">
                 <v:textbox style="mso-fit-shape-to-text:t" inset="0,0,0,0">
                   <w:txbxContent>
-                    <w:bookmarkStart w:id="30" w:name="_Ref213402956"/>
+                    <w:bookmarkStart w:id="29" w:name="_Ref213402956"/>
                     <w:p>
                       <w:pPr>
                         <w:pStyle w:val="Kpalrs"/>
@@ -5437,7 +5723,7 @@
                       <w:r>
                         <w:t>. ábra</w:t>
                       </w:r>
-                      <w:bookmarkEnd w:id="30"/>
+                      <w:bookmarkEnd w:id="29"/>
                       <w:r>
                         <w:t xml:space="preserve"> Tipikus ASP.NET Core Web Api design</w:t>
                       </w:r>
@@ -5622,8 +5908,8 @@
         <w:t xml:space="preserve"> </w:t>
       </w:r>
     </w:p>
-    <w:bookmarkStart w:id="31" w:name="_MON_1824023448"/>
-    <w:bookmarkEnd w:id="31"/>
+    <w:bookmarkStart w:id="30" w:name="_MON_1824023448"/>
+    <w:bookmarkEnd w:id="30"/>
     <w:p>
       <w:pPr>
         <w:keepNext/>
@@ -5652,11 +5938,11 @@
           <v:shape id="_x0000_i1025" type="#_x0000_t75" style="width:453.6pt;height:33.1pt" o:ole="">
             <v:imagedata r:id="rId15" o:title=""/>
           </v:shape>
-          <o:OLEObject Type="Embed" ProgID="Word.OpenDocumentText.12" ShapeID="_x0000_i1025" DrawAspect="Content" ObjectID="_1824555432" r:id="rId16"/>
+          <o:OLEObject Type="Embed" ProgID="Word.OpenDocumentText.12" ShapeID="_x0000_i1025" DrawAspect="Content" ObjectID="_1824632427" r:id="rId16"/>
         </w:object>
       </w:r>
     </w:p>
-    <w:bookmarkStart w:id="32" w:name="_Ref213410736"/>
+    <w:bookmarkStart w:id="31" w:name="_Ref213410736"/>
     <w:p>
       <w:pPr>
         <w:pStyle w:val="Kpalrs"/>
@@ -5682,7 +5968,7 @@
       <w:r>
         <w:t>. ábra</w:t>
       </w:r>
-      <w:bookmarkEnd w:id="32"/>
+      <w:bookmarkEnd w:id="31"/>
       <w:r>
         <w:t xml:space="preserve"> Kontroller osztály fejléc</w:t>
       </w:r>
@@ -5749,8 +6035,8 @@
         <w:t>.</w:t>
       </w:r>
     </w:p>
-    <w:bookmarkStart w:id="33" w:name="_MON_1824023979"/>
-    <w:bookmarkEnd w:id="33"/>
+    <w:bookmarkStart w:id="32" w:name="_MON_1824023979"/>
+    <w:bookmarkEnd w:id="32"/>
     <w:p>
       <w:pPr>
         <w:keepNext/>
@@ -5760,11 +6046,11 @@
           <v:shape id="_x0000_i1026" type="#_x0000_t75" style="width:453.6pt;height:86.15pt" o:ole="">
             <v:imagedata r:id="rId17" o:title=""/>
           </v:shape>
-          <o:OLEObject Type="Embed" ProgID="Word.OpenDocumentText.12" ShapeID="_x0000_i1026" DrawAspect="Content" ObjectID="_1824555433" r:id="rId18"/>
+          <o:OLEObject Type="Embed" ProgID="Word.OpenDocumentText.12" ShapeID="_x0000_i1026" DrawAspect="Content" ObjectID="_1824632428" r:id="rId18"/>
         </w:object>
       </w:r>
     </w:p>
-    <w:bookmarkStart w:id="34" w:name="_Ref213411586"/>
+    <w:bookmarkStart w:id="33" w:name="_Ref213411586"/>
     <w:p>
       <w:pPr>
         <w:pStyle w:val="Kpalrs"/>
@@ -5790,7 +6076,7 @@
       <w:r>
         <w:t>. ábra</w:t>
       </w:r>
-      <w:bookmarkEnd w:id="34"/>
+      <w:bookmarkEnd w:id="33"/>
       <w:r>
         <w:t xml:space="preserve"> Egyszerű Book objektum lekérdezése id alapján</w:t>
       </w:r>
@@ -5992,11 +6278,11 @@
       <w:pPr>
         <w:pStyle w:val="Cmsor3"/>
       </w:pPr>
-      <w:bookmarkStart w:id="35" w:name="_Toc213942487"/>
+      <w:bookmarkStart w:id="34" w:name="_Toc214019484"/>
       <w:r>
         <w:t>Dependency Injection</w:t>
       </w:r>
-      <w:bookmarkEnd w:id="35"/>
+      <w:bookmarkEnd w:id="34"/>
     </w:p>
     <w:p>
       <w:r>
@@ -6018,8 +6304,8 @@
         <w:t xml:space="preserve"> Függőséginjektálásnál célszerű egy közös fájlt létrehozni, ahol ezt elvégezzük.</w:t>
       </w:r>
     </w:p>
-    <w:bookmarkStart w:id="36" w:name="_MON_1824027264"/>
-    <w:bookmarkEnd w:id="36"/>
+    <w:bookmarkStart w:id="35" w:name="_MON_1824027264"/>
+    <w:bookmarkEnd w:id="35"/>
     <w:p>
       <w:pPr>
         <w:keepNext/>
@@ -6029,7 +6315,7 @@
           <v:shape id="_x0000_i1027" type="#_x0000_t75" style="width:453.6pt;height:42pt" o:ole="">
             <v:imagedata r:id="rId19" o:title=""/>
           </v:shape>
-          <o:OLEObject Type="Embed" ProgID="Word.OpenDocumentText.12" ShapeID="_x0000_i1027" DrawAspect="Content" ObjectID="_1824555434" r:id="rId20"/>
+          <o:OLEObject Type="Embed" ProgID="Word.OpenDocumentText.12" ShapeID="_x0000_i1027" DrawAspect="Content" ObjectID="_1824632429" r:id="rId20"/>
         </w:object>
       </w:r>
     </w:p>
@@ -6037,27 +6323,14 @@
       <w:pPr>
         <w:pStyle w:val="Kpalrs"/>
       </w:pPr>
-      <w:r>
-        <w:fldChar w:fldCharType="begin"/>
-      </w:r>
-      <w:r>
-        <w:instrText xml:space="preserve"> SEQ ábra \* ARABIC </w:instrText>
-      </w:r>
-      <w:r>
-        <w:fldChar w:fldCharType="separate"/>
-      </w:r>
-      <w:r>
-        <w:rPr>
-          <w:noProof/>
-        </w:rPr>
-        <w:t>5</w:t>
-      </w:r>
-      <w:r>
-        <w:rPr>
-          <w:noProof/>
-        </w:rPr>
-        <w:fldChar w:fldCharType="end"/>
-      </w:r>
+      <w:fldSimple w:instr=" SEQ ábra \* ARABIC ">
+        <w:r>
+          <w:rPr>
+            <w:noProof/>
+          </w:rPr>
+          <w:t>5</w:t>
+        </w:r>
+      </w:fldSimple>
       <w:r>
         <w:t>. ábra A három leggyakoribb függőséginjektálás</w:t>
       </w:r>
@@ -6160,7 +6433,7 @@
       <w:pPr>
         <w:pStyle w:val="Cmsor2"/>
       </w:pPr>
-      <w:bookmarkStart w:id="37" w:name="_Toc213942488"/>
+      <w:bookmarkStart w:id="36" w:name="_Toc214019485"/>
       <w:r>
         <w:t xml:space="preserve">Entity </w:t>
       </w:r>
@@ -6170,7 +6443,7 @@
       <w:r>
         <w:t>ramework</w:t>
       </w:r>
-      <w:bookmarkEnd w:id="37"/>
+      <w:bookmarkEnd w:id="36"/>
     </w:p>
     <w:p>
       <w:r>
@@ -6229,13 +6502,13 @@
       <w:pPr>
         <w:pStyle w:val="Cmsor3"/>
       </w:pPr>
-      <w:bookmarkStart w:id="38" w:name="_Objektum-relációs_leképezés"/>
-      <w:bookmarkStart w:id="39" w:name="_Toc213942489"/>
+      <w:bookmarkStart w:id="37" w:name="_Objektum-relációs_leképezés"/>
+      <w:bookmarkStart w:id="38" w:name="_Toc214019486"/>
+      <w:bookmarkEnd w:id="37"/>
+      <w:r>
+        <w:t>Objektum-relációs leképezés</w:t>
+      </w:r>
       <w:bookmarkEnd w:id="38"/>
-      <w:r>
-        <w:t>Objektum-relációs leképezés</w:t>
-      </w:r>
-      <w:bookmarkEnd w:id="39"/>
     </w:p>
     <w:p>
       <w:r>
@@ -6346,7 +6619,7 @@
                       </wps:spPr>
                       <wps:txbx>
                         <w:txbxContent>
-                          <w:bookmarkStart w:id="40" w:name="_Ref213339891"/>
+                          <w:bookmarkStart w:id="39" w:name="_Ref213339891"/>
                           <w:p>
                             <w:pPr>
                               <w:pStyle w:val="Kpalrs"/>
@@ -6389,7 +6662,7 @@
                             <w:r>
                               <w:t>. ábra</w:t>
                             </w:r>
-                            <w:bookmarkEnd w:id="40"/>
+                            <w:bookmarkEnd w:id="39"/>
                             <w:r>
                               <w:t xml:space="preserve"> Példa objektum-relációs leképezésre</w:t>
                             </w:r>
@@ -6440,7 +6713,7 @@
               <v:shape w14:anchorId="52BCD759" id="Szövegdoboz 3" o:spid="_x0000_s1027" type="#_x0000_t202" style="position:absolute;left:0;text-align:left;margin-left:0;margin-top:186.75pt;width:425.2pt;height:.05pt;z-index:251659264;visibility:visible;mso-wrap-style:square;mso-wrap-distance-left:9pt;mso-wrap-distance-top:0;mso-wrap-distance-right:9pt;mso-wrap-distance-bottom:0;mso-position-horizontal:absolute;mso-position-horizontal-relative:text;mso-position-vertical:absolute;mso-position-vertical-relative:text;v-text-anchor:top" o:gfxdata="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" stroked="f">
                 <v:textbox style="mso-fit-shape-to-text:t" inset="0,0,0,0">
                   <w:txbxContent>
-                    <w:bookmarkStart w:id="41" w:name="_Ref213339891"/>
+                    <w:bookmarkStart w:id="40" w:name="_Ref213339891"/>
                     <w:p>
                       <w:pPr>
                         <w:pStyle w:val="Kpalrs"/>
@@ -6483,7 +6756,7 @@
                       <w:r>
                         <w:t>. ábra</w:t>
                       </w:r>
-                      <w:bookmarkEnd w:id="41"/>
+                      <w:bookmarkEnd w:id="40"/>
                       <w:r>
                         <w:t xml:space="preserve"> Példa objektum-relációs leképezésre</w:t>
                       </w:r>
@@ -6682,8 +6955,8 @@
         <w:t>: FirstName</w:t>
       </w:r>
     </w:p>
-    <w:bookmarkStart w:id="42" w:name="_MON_1823949849"/>
-    <w:bookmarkEnd w:id="42"/>
+    <w:bookmarkStart w:id="41" w:name="_MON_1823949849"/>
+    <w:bookmarkEnd w:id="41"/>
     <w:p>
       <w:pPr>
         <w:keepNext/>
@@ -6694,7 +6967,7 @@
           <v:shape id="_x0000_i1028" type="#_x0000_t75" style="width:453.6pt;height:19.8pt" o:ole="">
             <v:imagedata r:id="rId22" o:title=""/>
           </v:shape>
-          <o:OLEObject Type="Embed" ProgID="Word.OpenDocumentText.12" ShapeID="_x0000_i1028" DrawAspect="Content" ObjectID="_1824555435" r:id="rId23"/>
+          <o:OLEObject Type="Embed" ProgID="Word.OpenDocumentText.12" ShapeID="_x0000_i1028" DrawAspect="Content" ObjectID="_1824632430" r:id="rId23"/>
         </w:object>
       </w:r>
     </w:p>
@@ -6702,27 +6975,14 @@
       <w:pPr>
         <w:pStyle w:val="Kpalrs"/>
       </w:pPr>
-      <w:r>
-        <w:fldChar w:fldCharType="begin"/>
-      </w:r>
-      <w:r>
-        <w:instrText xml:space="preserve"> SEQ ábra \* ARABIC </w:instrText>
-      </w:r>
-      <w:r>
-        <w:fldChar w:fldCharType="separate"/>
-      </w:r>
-      <w:r>
-        <w:rPr>
-          <w:noProof/>
-        </w:rPr>
-        <w:t>7</w:t>
-      </w:r>
-      <w:r>
-        <w:rPr>
-          <w:noProof/>
-        </w:rPr>
-        <w:fldChar w:fldCharType="end"/>
-      </w:r>
+      <w:fldSimple w:instr=" SEQ ábra \* ARABIC ">
+        <w:r>
+          <w:rPr>
+            <w:noProof/>
+          </w:rPr>
+          <w:t>7</w:t>
+        </w:r>
+      </w:fldSimple>
       <w:r>
         <w:t>. ábra Táblázat reprezentáció Entity Framework Core-ban</w:t>
       </w:r>
@@ -6731,7 +6991,7 @@
       <w:r>
         <w:t>A táblázat nevénél is figyelni kell a névkonvencióra. A táblázat Entity Framework Core-ban</w:t>
       </w:r>
-      <w:bookmarkEnd w:id="24"/>
+      <w:bookmarkEnd w:id="22"/>
       <w:r>
         <w:t xml:space="preserve">, </w:t>
       </w:r>
@@ -6749,16 +7009,21 @@
       <w:pPr>
         <w:pStyle w:val="Cmsor3"/>
       </w:pPr>
-      <w:bookmarkStart w:id="43" w:name="_Toc213942490"/>
+      <w:bookmarkStart w:id="42" w:name="_Toc214019487"/>
       <w:r>
         <w:lastRenderedPageBreak/>
         <w:t>Navigációs tulajdonságok</w:t>
       </w:r>
+      <w:bookmarkEnd w:id="42"/>
+    </w:p>
+    <w:p>
+      <w:r>
+        <w:t>A navigációs tulajdonságok rendkívül hasznosak: segítségükkel az adatbázisban valamilyen asszociációban álló táblák között, a C#-ban reprezentált objektumok szintjén könnyedén navigálhatunk, anélkül hogy a kapc</w:t>
+      </w:r>
+      <w:bookmarkStart w:id="43" w:name="_GoBack"/>
       <w:bookmarkEnd w:id="43"/>
-    </w:p>
-    <w:p>
-      <w:r>
-        <w:t>A navigációs tulajdonságok rendkívül hasznosak: segítségükkel az adatbázisban valamilyen asszociációban álló táblák között, a C#-ban reprezentált objektumok szintjén könnyedén navigálhatunk, anélkül hogy a kapcsolótáblát külön le kellene kérdeznünk és manuálisan összekapcsolnunk az adatait. Ez azt jelenti, hogy egy osztályban tulajdonságokkal jelölhetjük a táblák közötti kapcsolatokat, így a kapcsolat másik oldalán lévő C#-objektumok bármely elemét közvetlenül elérhetjük. A</w:t>
+      <w:r>
+        <w:t>solótáblát külön le kellene kérdeznünk és manuálisan összekapcsolnunk az adatait. Ez azt jelenti, hogy egy osztályban tulajdonságokkal jelölhetjük a táblák közötti kapcsolatokat, így a kapcsolat másik oldalán lévő C#-objektumok bármely elemét közvetlenül elérhetjük. A</w:t>
       </w:r>
       <w:r>
         <w:t xml:space="preserve"> </w:t>
@@ -6786,7 +7051,7 @@
           <v:shape id="_x0000_i1029" type="#_x0000_t75" style="width:453.6pt;height:52.9pt" o:ole="">
             <v:imagedata r:id="rId24" o:title=""/>
           </v:shape>
-          <o:OLEObject Type="Embed" ProgID="Word.OpenDocumentText.12" ShapeID="_x0000_i1029" DrawAspect="Content" ObjectID="_1824555436" r:id="rId25"/>
+          <o:OLEObject Type="Embed" ProgID="Word.OpenDocumentText.12" ShapeID="_x0000_i1029" DrawAspect="Content" ObjectID="_1824632431" r:id="rId25"/>
         </w:object>
       </w:r>
     </w:p>
@@ -6897,7 +7162,7 @@
           <v:shape id="_x0000_i1030" type="#_x0000_t75" style="width:453.6pt;height:119.3pt" o:ole="">
             <v:imagedata r:id="rId26" o:title=""/>
           </v:shape>
-          <o:OLEObject Type="Embed" ProgID="Word.OpenDocumentText.12" ShapeID="_x0000_i1030" DrawAspect="Content" ObjectID="_1824555437" r:id="rId27"/>
+          <o:OLEObject Type="Embed" ProgID="Word.OpenDocumentText.12" ShapeID="_x0000_i1030" DrawAspect="Content" ObjectID="_1824632432" r:id="rId27"/>
         </w:object>
       </w:r>
     </w:p>
@@ -7050,7 +7315,7 @@
       <w:pPr>
         <w:pStyle w:val="Cmsor2"/>
       </w:pPr>
-      <w:bookmarkStart w:id="48" w:name="_Toc213942491"/>
+      <w:bookmarkStart w:id="48" w:name="_Toc214019488"/>
       <w:r>
         <w:t>React Native</w:t>
       </w:r>
@@ -7071,7 +7336,7 @@
       <w:pPr>
         <w:pStyle w:val="Cmsor3"/>
       </w:pPr>
-      <w:bookmarkStart w:id="49" w:name="_Toc213942492"/>
+      <w:bookmarkStart w:id="49" w:name="_Toc214019489"/>
       <w:r>
         <w:t>JSX Tagek</w:t>
       </w:r>
@@ -7087,13 +7352,14 @@
     <w:p>
       <w:pPr>
         <w:keepNext/>
-      </w:pPr>
-      <w:r>
-        <w:object w:dxaOrig="9072" w:dyaOrig="1875" w14:anchorId="6D53DE00">
-          <v:shape id="_x0000_i1031" type="#_x0000_t75" style="width:453.6pt;height:93.75pt" o:ole="">
+        <w:ind w:firstLine="0"/>
+      </w:pPr>
+      <w:r>
+        <w:object w:dxaOrig="9072" w:dyaOrig="1871" w14:anchorId="6D53DE00">
+          <v:shape id="_x0000_i1052" type="#_x0000_t75" style="width:453.6pt;height:93.55pt" o:ole="">
             <v:imagedata r:id="rId28" o:title=""/>
           </v:shape>
-          <o:OLEObject Type="Embed" ProgID="Word.OpenDocumentText.12" ShapeID="_x0000_i1031" DrawAspect="Content" ObjectID="_1824555438" r:id="rId29"/>
+          <o:OLEObject Type="Embed" ProgID="Word.OpenDocumentText.12" ShapeID="_x0000_i1052" DrawAspect="Content" ObjectID="_1824632433" r:id="rId29"/>
         </w:object>
       </w:r>
     </w:p>
@@ -7224,11 +7490,13 @@
       <w:pPr>
         <w:pStyle w:val="Cmsor3"/>
       </w:pPr>
-      <w:bookmarkStart w:id="52" w:name="_Toc213942493"/>
+      <w:bookmarkStart w:id="52" w:name="_Expo"/>
+      <w:bookmarkStart w:id="53" w:name="_Toc214019490"/>
+      <w:bookmarkEnd w:id="52"/>
       <w:r>
         <w:t>Expo</w:t>
       </w:r>
-      <w:bookmarkEnd w:id="52"/>
+      <w:bookmarkEnd w:id="53"/>
     </w:p>
     <w:p>
       <w:r>
@@ -7266,11 +7534,11 @@
       <w:pPr>
         <w:pStyle w:val="Cmsor3"/>
       </w:pPr>
-      <w:bookmarkStart w:id="53" w:name="_Toc213942494"/>
+      <w:bookmarkStart w:id="54" w:name="_Toc214019491"/>
       <w:r>
         <w:t>React Native Elements</w:t>
       </w:r>
-      <w:bookmarkEnd w:id="53"/>
+      <w:bookmarkEnd w:id="54"/>
     </w:p>
     <w:p>
       <w:r>
@@ -7351,14 +7619,14 @@
       <w:pPr>
         <w:pStyle w:val="Cmsor2"/>
       </w:pPr>
-      <w:bookmarkStart w:id="54" w:name="_Toc213942495"/>
+      <w:bookmarkStart w:id="55" w:name="_Toc214019492"/>
       <w:r>
         <w:t>Python Service Fast</w:t>
       </w:r>
       <w:r>
         <w:t>API</w:t>
       </w:r>
-      <w:bookmarkEnd w:id="54"/>
+      <w:bookmarkEnd w:id="55"/>
     </w:p>
     <w:p>
       <w:r>
@@ -7371,18 +7639,19 @@
         <w:t>.</w:t>
       </w:r>
     </w:p>
-    <w:bookmarkStart w:id="55" w:name="_MON_1824038574"/>
-    <w:bookmarkEnd w:id="55"/>
+    <w:bookmarkStart w:id="56" w:name="_MON_1824038574"/>
+    <w:bookmarkEnd w:id="56"/>
     <w:p>
       <w:pPr>
         <w:keepNext/>
-      </w:pPr>
-      <w:r>
-        <w:object w:dxaOrig="9072" w:dyaOrig="2314" w14:anchorId="36B796DD">
-          <v:shape id="_x0000_i1032" type="#_x0000_t75" style="width:453.6pt;height:115.7pt" o:ole="">
+        <w:ind w:firstLine="0"/>
+      </w:pPr>
+      <w:r>
+        <w:object w:dxaOrig="9072" w:dyaOrig="1866" w14:anchorId="36B796DD">
+          <v:shape id="_x0000_i1054" type="#_x0000_t75" style="width:453.6pt;height:93.3pt" o:ole="">
             <v:imagedata r:id="rId30" o:title=""/>
           </v:shape>
-          <o:OLEObject Type="Embed" ProgID="Word.OpenDocumentText.12" ShapeID="_x0000_i1032" DrawAspect="Content" ObjectID="_1824555439" r:id="rId31"/>
+          <o:OLEObject Type="Embed" ProgID="Word.OpenDocumentText.12" ShapeID="_x0000_i1054" DrawAspect="Content" ObjectID="_1824632434" r:id="rId31"/>
         </w:object>
       </w:r>
     </w:p>
@@ -7390,27 +7659,14 @@
       <w:pPr>
         <w:pStyle w:val="Kpalrs"/>
       </w:pPr>
-      <w:r>
-        <w:fldChar w:fldCharType="begin"/>
-      </w:r>
-      <w:r>
-        <w:instrText xml:space="preserve"> SEQ ábra \* ARABIC </w:instrText>
-      </w:r>
-      <w:r>
-        <w:fldChar w:fldCharType="separate"/>
-      </w:r>
-      <w:r>
-        <w:rPr>
-          <w:noProof/>
-        </w:rPr>
-        <w:t>11</w:t>
-      </w:r>
-      <w:r>
-        <w:rPr>
-          <w:noProof/>
-        </w:rPr>
-        <w:fldChar w:fldCharType="end"/>
-      </w:r>
+      <w:fldSimple w:instr=" SEQ ábra \* ARABIC ">
+        <w:r>
+          <w:rPr>
+            <w:noProof/>
+          </w:rPr>
+          <w:t>11</w:t>
+        </w:r>
+      </w:fldSimple>
       <w:r>
         <w:t>. ábra Fast Api GET végpont</w:t>
       </w:r>
@@ -7444,16 +7700,19 @@
       <w:pPr>
         <w:pStyle w:val="Cmsor2"/>
       </w:pPr>
-      <w:bookmarkStart w:id="56" w:name="_Toc213942496"/>
+      <w:bookmarkStart w:id="57" w:name="_Toc214019493"/>
+      <w:r>
+        <w:t>Tárgyfelismerés</w:t>
+      </w:r>
+      <w:bookmarkEnd w:id="57"/>
+    </w:p>
+    <w:p>
+      <w:r>
+        <w:t xml:space="preserve">A tárgyfelismerés, vagy más néven objektumdetektálás, a programom egyik legfontosabb része. Ez teszi lehetővé, hogy a felhasználó által készített képből a rendszer </w:t>
+      </w:r>
       <w:r>
         <w:lastRenderedPageBreak/>
-        <w:t>Tárgyfelismerés</w:t>
-      </w:r>
-      <w:bookmarkEnd w:id="56"/>
-    </w:p>
-    <w:p>
-      <w:r>
-        <w:t>A tárgyfelismerés, vagy más néven objektumdetektálás, a programom egyik legfontosabb része. Ez teszi lehetővé, hogy a felhasználó által készített képből a rendszer kivágja azt a részt, amely a kollekcióba felvenni kívánt tárgyat tartalmazza. Mivel a legtöbb könyvtár és segédanyag mesterséges intelligenciához Python nyelven érhető el, ezért a tárgyfelismerést Pythonban valósítottam meg.</w:t>
+        <w:t>kivágja azt a részt, amely a kollekcióba felvenni kívánt tárgyat tartalmazza. Mivel a legtöbb könyvtár és segédanyag mesterséges intelligenciához Python nyelven érhető el, ezért a tárgyfelismerést Pythonban valósítottam meg.</w:t>
       </w:r>
       <w:r>
         <w:t xml:space="preserve"> </w:t>
@@ -7484,11 +7743,11 @@
       <w:pPr>
         <w:pStyle w:val="Cmsor3"/>
       </w:pPr>
-      <w:bookmarkStart w:id="57" w:name="_Toc213942497"/>
+      <w:bookmarkStart w:id="58" w:name="_Toc214019494"/>
       <w:r>
         <w:t>Label Studio</w:t>
       </w:r>
-      <w:bookmarkEnd w:id="57"/>
+      <w:bookmarkEnd w:id="58"/>
     </w:p>
     <w:p>
       <w:r>
@@ -7571,11 +7830,11 @@
       <w:pPr>
         <w:pStyle w:val="Cmsor3"/>
       </w:pPr>
-      <w:bookmarkStart w:id="58" w:name="_Toc213942498"/>
+      <w:bookmarkStart w:id="59" w:name="_Toc214019495"/>
       <w:r>
         <w:t>YOLOv8</w:t>
       </w:r>
-      <w:bookmarkEnd w:id="58"/>
+      <w:bookmarkEnd w:id="59"/>
     </w:p>
     <w:p>
       <w:r>
@@ -7585,22 +7844,23 @@
         <w:t>.</w:t>
       </w:r>
     </w:p>
-    <w:bookmarkStart w:id="59" w:name="_MON_1824045853"/>
-    <w:bookmarkEnd w:id="59"/>
+    <w:bookmarkStart w:id="60" w:name="_MON_1824045853"/>
+    <w:bookmarkEnd w:id="60"/>
     <w:p>
       <w:pPr>
         <w:keepNext/>
-      </w:pPr>
-      <w:r>
-        <w:object w:dxaOrig="9072" w:dyaOrig="3294" w14:anchorId="5C7E1917">
-          <v:shape id="_x0000_i1033" type="#_x0000_t75" style="width:453.6pt;height:164.7pt" o:ole="">
+        <w:ind w:firstLine="0"/>
+      </w:pPr>
+      <w:r>
+        <w:object w:dxaOrig="9072" w:dyaOrig="3289" w14:anchorId="5C7E1917">
+          <v:shape id="_x0000_i1060" type="#_x0000_t75" style="width:453.6pt;height:164.45pt" o:ole="">
             <v:imagedata r:id="rId32" o:title=""/>
           </v:shape>
-          <o:OLEObject Type="Embed" ProgID="Word.OpenDocumentText.12" ShapeID="_x0000_i1033" DrawAspect="Content" ObjectID="_1824555440" r:id="rId33"/>
+          <o:OLEObject Type="Embed" ProgID="Word.OpenDocumentText.12" ShapeID="_x0000_i1060" DrawAspect="Content" ObjectID="_1824632435" r:id="rId33"/>
         </w:object>
       </w:r>
     </w:p>
-    <w:bookmarkStart w:id="60" w:name="_Ref213433282"/>
+    <w:bookmarkStart w:id="61" w:name="_Ref213433282"/>
     <w:p>
       <w:pPr>
         <w:pStyle w:val="Kpalrs"/>
@@ -7626,7 +7886,7 @@
       <w:r>
         <w:t>. ábra</w:t>
       </w:r>
-      <w:bookmarkEnd w:id="60"/>
+      <w:bookmarkEnd w:id="61"/>
       <w:r>
         <w:t xml:space="preserve"> YOLOv8 modell betanítása</w:t>
       </w:r>
@@ -7856,23 +8116,24 @@
         <w:t xml:space="preserve"> néven.</w:t>
       </w:r>
     </w:p>
-    <w:bookmarkStart w:id="61" w:name="_MON_1824048310"/>
-    <w:bookmarkEnd w:id="61"/>
+    <w:bookmarkStart w:id="62" w:name="_MON_1824048310"/>
+    <w:bookmarkEnd w:id="62"/>
     <w:p>
       <w:pPr>
         <w:keepNext/>
+        <w:ind w:firstLine="0"/>
         <w:jc w:val="left"/>
       </w:pPr>
       <w:r>
-        <w:object w:dxaOrig="9072" w:dyaOrig="1302" w14:anchorId="3306D0D7">
-          <v:shape id="_x0000_i1034" type="#_x0000_t75" style="width:453.6pt;height:65.25pt" o:ole="">
+        <w:object w:dxaOrig="9072" w:dyaOrig="1299" w14:anchorId="3306D0D7">
+          <v:shape id="_x0000_i1062" type="#_x0000_t75" style="width:453.6pt;height:65.1pt" o:ole="">
             <v:imagedata r:id="rId34" o:title=""/>
           </v:shape>
-          <o:OLEObject Type="Embed" ProgID="Word.OpenDocumentText.12" ShapeID="_x0000_i1034" DrawAspect="Content" ObjectID="_1824555441" r:id="rId35"/>
+          <o:OLEObject Type="Embed" ProgID="Word.OpenDocumentText.12" ShapeID="_x0000_i1062" DrawAspect="Content" ObjectID="_1824632436" r:id="rId35"/>
         </w:object>
       </w:r>
     </w:p>
-    <w:bookmarkStart w:id="62" w:name="_Ref213435847"/>
+    <w:bookmarkStart w:id="63" w:name="_Ref213435847"/>
     <w:p>
       <w:pPr>
         <w:pStyle w:val="Kpalrs"/>
@@ -7898,7 +8159,7 @@
       <w:r>
         <w:t>. ábra</w:t>
       </w:r>
-      <w:bookmarkEnd w:id="62"/>
+      <w:bookmarkEnd w:id="63"/>
       <w:r>
         <w:t xml:space="preserve"> Betanított YOLO modell használata</w:t>
       </w:r>
@@ -7948,11 +8209,11 @@
       <w:pPr>
         <w:pStyle w:val="Cmsor2"/>
       </w:pPr>
-      <w:bookmarkStart w:id="63" w:name="_Toc213942499"/>
+      <w:bookmarkStart w:id="64" w:name="_Toc214019496"/>
       <w:r>
         <w:t>Hasonlóságvizsgálat</w:t>
       </w:r>
-      <w:bookmarkEnd w:id="63"/>
+      <w:bookmarkEnd w:id="64"/>
     </w:p>
     <w:p>
       <w:r>
@@ -7985,13 +8246,13 @@
       <w:pPr>
         <w:pStyle w:val="Cmsor3"/>
       </w:pPr>
-      <w:bookmarkStart w:id="64" w:name="_Embedding"/>
-      <w:bookmarkStart w:id="65" w:name="_Toc213942500"/>
-      <w:bookmarkEnd w:id="64"/>
+      <w:bookmarkStart w:id="65" w:name="_Embedding"/>
+      <w:bookmarkStart w:id="66" w:name="_Toc214019497"/>
+      <w:bookmarkEnd w:id="65"/>
       <w:r>
         <w:t>Embedding</w:t>
       </w:r>
-      <w:bookmarkEnd w:id="65"/>
+      <w:bookmarkEnd w:id="66"/>
     </w:p>
     <w:p>
       <w:r>
@@ -8081,7 +8342,7 @@
         </w:drawing>
       </w:r>
     </w:p>
-    <w:bookmarkStart w:id="66" w:name="_Ref213496200"/>
+    <w:bookmarkStart w:id="67" w:name="_Ref213496200"/>
     <w:p>
       <w:pPr>
         <w:pStyle w:val="Kpalrs"/>
@@ -8107,7 +8368,7 @@
       <w:r>
         <w:t>. ábra</w:t>
       </w:r>
-      <w:bookmarkEnd w:id="66"/>
+      <w:bookmarkEnd w:id="67"/>
       <w:r>
         <w:t xml:space="preserve"> Embedding vektortér példa</w:t>
       </w:r>
@@ -8236,27 +8497,14 @@
       <w:pPr>
         <w:pStyle w:val="Kpalrs"/>
       </w:pPr>
-      <w:r>
-        <w:fldChar w:fldCharType="begin"/>
-      </w:r>
-      <w:r>
-        <w:instrText xml:space="preserve"> SEQ ábra \* ARABIC </w:instrText>
-      </w:r>
-      <w:r>
-        <w:fldChar w:fldCharType="separate"/>
-      </w:r>
-      <w:r>
-        <w:rPr>
-          <w:noProof/>
-        </w:rPr>
-        <w:t>15</w:t>
-      </w:r>
-      <w:r>
-        <w:rPr>
-          <w:noProof/>
-        </w:rPr>
-        <w:fldChar w:fldCharType="end"/>
-      </w:r>
+      <w:fldSimple w:instr=" SEQ ábra \* ARABIC ">
+        <w:r>
+          <w:rPr>
+            <w:noProof/>
+          </w:rPr>
+          <w:t>15</w:t>
+        </w:r>
+      </w:fldSimple>
       <w:r>
         <w:t>. ábra Cos hasonlóság vizsgálat vektorokon</w:t>
       </w:r>
@@ -8307,11 +8555,11 @@
       <w:pPr>
         <w:pStyle w:val="Cmsor3"/>
       </w:pPr>
-      <w:bookmarkStart w:id="67" w:name="_Toc213942501"/>
+      <w:bookmarkStart w:id="68" w:name="_Toc214019498"/>
       <w:r>
         <w:t>Metric Learning</w:t>
       </w:r>
-      <w:bookmarkEnd w:id="67"/>
+      <w:bookmarkEnd w:id="68"/>
     </w:p>
     <w:p>
       <w:r>
@@ -8644,12 +8892,12 @@
       <w:pPr>
         <w:pStyle w:val="Cmsor1"/>
       </w:pPr>
-      <w:bookmarkStart w:id="68" w:name="_Toc213942502"/>
+      <w:bookmarkStart w:id="69" w:name="_Toc214019499"/>
       <w:r>
         <w:lastRenderedPageBreak/>
         <w:t>Architektúra</w:t>
       </w:r>
-      <w:bookmarkEnd w:id="68"/>
+      <w:bookmarkEnd w:id="69"/>
     </w:p>
     <w:p>
       <w:r>
@@ -8660,13 +8908,13 @@
       <w:pPr>
         <w:pStyle w:val="Cmsor2"/>
       </w:pPr>
-      <w:bookmarkStart w:id="69" w:name="_Mappastruktúra"/>
-      <w:bookmarkStart w:id="70" w:name="_Toc213942503"/>
-      <w:bookmarkEnd w:id="69"/>
+      <w:bookmarkStart w:id="70" w:name="_Mappastruktúra"/>
+      <w:bookmarkStart w:id="71" w:name="_Toc214019500"/>
+      <w:bookmarkEnd w:id="70"/>
       <w:r>
         <w:t>Mappastruktúra</w:t>
       </w:r>
-      <w:bookmarkEnd w:id="70"/>
+      <w:bookmarkEnd w:id="71"/>
     </w:p>
     <w:p>
       <w:pPr>
@@ -8721,7 +8969,7 @@
         </w:drawing>
       </w:r>
     </w:p>
-    <w:bookmarkStart w:id="71" w:name="_Ref213667843"/>
+    <w:bookmarkStart w:id="72" w:name="_Ref213667843"/>
     <w:p>
       <w:pPr>
         <w:pStyle w:val="Kpalrs"/>
@@ -8747,7 +8995,7 @@
       <w:r>
         <w:t>. ábra</w:t>
       </w:r>
-      <w:bookmarkEnd w:id="71"/>
+      <w:bookmarkEnd w:id="72"/>
       <w:r>
         <w:t xml:space="preserve"> A projekt mappastruktúrája Visual Studio-ban</w:t>
       </w:r>
@@ -9059,11 +9307,11 @@
       <w:pPr>
         <w:pStyle w:val="Cmsor2"/>
       </w:pPr>
-      <w:bookmarkStart w:id="72" w:name="_Toc213942504"/>
+      <w:bookmarkStart w:id="73" w:name="_Toc214019501"/>
       <w:r>
         <w:t>Adatbázisséma</w:t>
       </w:r>
-      <w:bookmarkEnd w:id="72"/>
+      <w:bookmarkEnd w:id="73"/>
     </w:p>
     <w:p>
       <w:r>
@@ -9105,7 +9353,7 @@
       <w:pPr>
         <w:pStyle w:val="Cmsor3"/>
       </w:pPr>
-      <w:bookmarkStart w:id="73" w:name="_Toc213942505"/>
+      <w:bookmarkStart w:id="74" w:name="_Toc214019502"/>
       <w:r>
         <w:lastRenderedPageBreak/>
         <w:t>Users, User</w:t>
@@ -9113,7 +9361,7 @@
       <w:r>
         <w:t>Contacts</w:t>
       </w:r>
-      <w:bookmarkEnd w:id="73"/>
+      <w:bookmarkEnd w:id="74"/>
     </w:p>
     <w:p>
       <w:pPr>
@@ -9165,27 +9413,14 @@
       <w:pPr>
         <w:pStyle w:val="Kpalrs"/>
       </w:pPr>
-      <w:r>
-        <w:fldChar w:fldCharType="begin"/>
-      </w:r>
-      <w:r>
-        <w:instrText xml:space="preserve"> SEQ ábra \* ARABIC </w:instrText>
-      </w:r>
-      <w:r>
-        <w:fldChar w:fldCharType="separate"/>
-      </w:r>
-      <w:r>
-        <w:rPr>
-          <w:noProof/>
-        </w:rPr>
-        <w:t>17</w:t>
-      </w:r>
-      <w:r>
-        <w:rPr>
-          <w:noProof/>
-        </w:rPr>
-        <w:fldChar w:fldCharType="end"/>
-      </w:r>
+      <w:fldSimple w:instr=" SEQ ábra \* ARABIC ">
+        <w:r>
+          <w:rPr>
+            <w:noProof/>
+          </w:rPr>
+          <w:t>17</w:t>
+        </w:r>
+      </w:fldSimple>
       <w:r>
         <w:t>. ábra ER diagram rés</w:t>
       </w:r>
@@ -9274,9 +9509,9 @@
       <w:pPr>
         <w:pStyle w:val="Cmsor3"/>
       </w:pPr>
-      <w:bookmarkStart w:id="74" w:name="_CollectionTypes,_Attributes,_ItemOp"/>
-      <w:bookmarkStart w:id="75" w:name="_Toc213942506"/>
-      <w:bookmarkEnd w:id="74"/>
+      <w:bookmarkStart w:id="75" w:name="_CollectionTypes,_Attributes,_ItemOp"/>
+      <w:bookmarkStart w:id="76" w:name="_Toc214019503"/>
+      <w:bookmarkEnd w:id="75"/>
       <w:r>
         <w:lastRenderedPageBreak/>
         <w:t>CollectionTypes, Attributes, ItemOptions</w:t>
@@ -9284,7 +9519,7 @@
       <w:r>
         <w:t>, ItemAttributes</w:t>
       </w:r>
-      <w:bookmarkEnd w:id="75"/>
+      <w:bookmarkEnd w:id="76"/>
     </w:p>
     <w:p>
       <w:pPr>
@@ -9333,7 +9568,7 @@
         </w:drawing>
       </w:r>
     </w:p>
-    <w:bookmarkStart w:id="76" w:name="_Ref213759595"/>
+    <w:bookmarkStart w:id="77" w:name="_Ref213759595"/>
     <w:p>
       <w:pPr>
         <w:pStyle w:val="Kpalrs"/>
@@ -9359,7 +9594,7 @@
       <w:r>
         <w:t>. ábra</w:t>
       </w:r>
-      <w:bookmarkEnd w:id="76"/>
+      <w:bookmarkEnd w:id="77"/>
       <w:r>
         <w:t xml:space="preserve"> </w:t>
       </w:r>
@@ -9482,12 +9717,12 @@
       <w:pPr>
         <w:pStyle w:val="Cmsor3"/>
       </w:pPr>
-      <w:bookmarkStart w:id="77" w:name="_Toc213942507"/>
+      <w:bookmarkStart w:id="78" w:name="_Toc214019504"/>
       <w:r>
         <w:lastRenderedPageBreak/>
         <w:t>Collections, Follows, Reactions</w:t>
       </w:r>
-      <w:bookmarkEnd w:id="77"/>
+      <w:bookmarkEnd w:id="78"/>
     </w:p>
     <w:p>
       <w:pPr>
@@ -9539,27 +9774,14 @@
       <w:pPr>
         <w:pStyle w:val="Kpalrs"/>
       </w:pPr>
-      <w:r>
-        <w:fldChar w:fldCharType="begin"/>
-      </w:r>
-      <w:r>
-        <w:instrText xml:space="preserve"> SEQ ábra \* ARABIC </w:instrText>
-      </w:r>
-      <w:r>
-        <w:fldChar w:fldCharType="separate"/>
-      </w:r>
-      <w:r>
-        <w:rPr>
-          <w:noProof/>
-        </w:rPr>
-        <w:t>19</w:t>
-      </w:r>
-      <w:r>
-        <w:rPr>
-          <w:noProof/>
-        </w:rPr>
-        <w:fldChar w:fldCharType="end"/>
-      </w:r>
+      <w:fldSimple w:instr=" SEQ ábra \* ARABIC ">
+        <w:r>
+          <w:rPr>
+            <w:noProof/>
+          </w:rPr>
+          <w:t>19</w:t>
+        </w:r>
+      </w:fldSimple>
       <w:r>
         <w:t xml:space="preserve">. ábra </w:t>
       </w:r>
@@ -9630,12 +9852,12 @@
       <w:pPr>
         <w:pStyle w:val="Cmsor3"/>
       </w:pPr>
-      <w:bookmarkStart w:id="78" w:name="_Toc213942508"/>
+      <w:bookmarkStart w:id="79" w:name="_Toc214019505"/>
       <w:r>
         <w:lastRenderedPageBreak/>
         <w:t>Items, ItemTags</w:t>
       </w:r>
-      <w:bookmarkEnd w:id="78"/>
+      <w:bookmarkEnd w:id="79"/>
     </w:p>
     <w:p>
       <w:pPr>
@@ -9687,27 +9909,14 @@
       <w:pPr>
         <w:pStyle w:val="Kpalrs"/>
       </w:pPr>
-      <w:r>
-        <w:fldChar w:fldCharType="begin"/>
-      </w:r>
-      <w:r>
-        <w:instrText xml:space="preserve"> SEQ ábra \* ARABIC </w:instrText>
-      </w:r>
-      <w:r>
-        <w:fldChar w:fldCharType="separate"/>
-      </w:r>
-      <w:r>
-        <w:rPr>
-          <w:noProof/>
-        </w:rPr>
-        <w:t>20</w:t>
-      </w:r>
-      <w:r>
-        <w:rPr>
-          <w:noProof/>
-        </w:rPr>
-        <w:fldChar w:fldCharType="end"/>
-      </w:r>
+      <w:fldSimple w:instr=" SEQ ábra \* ARABIC ">
+        <w:r>
+          <w:rPr>
+            <w:noProof/>
+          </w:rPr>
+          <w:t>20</w:t>
+        </w:r>
+      </w:fldSimple>
       <w:r>
         <w:t xml:space="preserve">. ábra </w:t>
       </w:r>
@@ -9844,12 +10053,12 @@
       <w:pPr>
         <w:pStyle w:val="Cmsor3"/>
       </w:pPr>
-      <w:bookmarkStart w:id="79" w:name="_Toc213942509"/>
+      <w:bookmarkStart w:id="80" w:name="_Toc214019506"/>
       <w:r>
         <w:lastRenderedPageBreak/>
         <w:t>Trades, TradeItems, Offers, OfferItems, TradeReviews</w:t>
       </w:r>
-      <w:bookmarkEnd w:id="79"/>
+      <w:bookmarkEnd w:id="80"/>
     </w:p>
     <w:p>
       <w:pPr>
@@ -9901,27 +10110,14 @@
       <w:pPr>
         <w:pStyle w:val="Kpalrs"/>
       </w:pPr>
-      <w:r>
-        <w:fldChar w:fldCharType="begin"/>
-      </w:r>
-      <w:r>
-        <w:instrText xml:space="preserve"> SEQ ábra \* ARABIC </w:instrText>
-      </w:r>
-      <w:r>
-        <w:fldChar w:fldCharType="separate"/>
-      </w:r>
-      <w:r>
-        <w:rPr>
-          <w:noProof/>
-        </w:rPr>
-        <w:t>21</w:t>
-      </w:r>
-      <w:r>
-        <w:rPr>
-          <w:noProof/>
-        </w:rPr>
-        <w:fldChar w:fldCharType="end"/>
-      </w:r>
+      <w:fldSimple w:instr=" SEQ ábra \* ARABIC ">
+        <w:r>
+          <w:rPr>
+            <w:noProof/>
+          </w:rPr>
+          <w:t>21</w:t>
+        </w:r>
+      </w:fldSimple>
       <w:r>
         <w:t xml:space="preserve">. ábra ER diagram részlet: trades, trade_items, offers, offer_items, trade_reviews </w:t>
       </w:r>
@@ -10130,11 +10326,11 @@
       <w:pPr>
         <w:pStyle w:val="Cmsor2"/>
       </w:pPr>
-      <w:bookmarkStart w:id="80" w:name="_Toc213942510"/>
+      <w:bookmarkStart w:id="81" w:name="_Toc214019507"/>
       <w:r>
         <w:t>Vektor adatbázisséma</w:t>
       </w:r>
-      <w:bookmarkEnd w:id="80"/>
+      <w:bookmarkEnd w:id="81"/>
     </w:p>
     <w:p>
       <w:r>
@@ -10244,12 +10440,12 @@
       <w:pPr>
         <w:pStyle w:val="Cmsor2"/>
       </w:pPr>
-      <w:bookmarkStart w:id="81" w:name="_Toc213942511"/>
+      <w:bookmarkStart w:id="82" w:name="_Toc214019508"/>
       <w:r>
         <w:lastRenderedPageBreak/>
         <w:t>Betanított modellek konvenció</w:t>
       </w:r>
-      <w:bookmarkEnd w:id="81"/>
+      <w:bookmarkEnd w:id="82"/>
     </w:p>
     <w:p>
       <w:r>
@@ -10335,11 +10531,11 @@
       <w:pPr>
         <w:pStyle w:val="Cmsor2"/>
       </w:pPr>
-      <w:bookmarkStart w:id="82" w:name="_Toc213942512"/>
+      <w:bookmarkStart w:id="83" w:name="_Toc214019509"/>
       <w:r>
         <w:t>„Univerzális” megoldás összefoglalás</w:t>
       </w:r>
-      <w:bookmarkEnd w:id="82"/>
+      <w:bookmarkEnd w:id="83"/>
     </w:p>
     <w:p>
       <w:r>
@@ -10488,12 +10684,12 @@
       <w:pPr>
         <w:pStyle w:val="Cmsor1"/>
       </w:pPr>
-      <w:bookmarkStart w:id="83" w:name="_Toc213942513"/>
+      <w:bookmarkStart w:id="84" w:name="_Toc214019510"/>
       <w:r>
         <w:lastRenderedPageBreak/>
         <w:t>Projekt részletezése</w:t>
       </w:r>
-      <w:bookmarkEnd w:id="83"/>
+      <w:bookmarkEnd w:id="84"/>
     </w:p>
     <w:p>
       <w:r>
@@ -10504,21 +10700,21 @@
       <w:pPr>
         <w:pStyle w:val="Cmsor2"/>
       </w:pPr>
-      <w:bookmarkStart w:id="84" w:name="_Toc213942514"/>
+      <w:bookmarkStart w:id="85" w:name="_Toc214019511"/>
       <w:r>
         <w:t>ASP.NET Core backend</w:t>
       </w:r>
-      <w:bookmarkEnd w:id="84"/>
+      <w:bookmarkEnd w:id="85"/>
     </w:p>
     <w:p>
       <w:pPr>
         <w:pStyle w:val="Cmsor3"/>
       </w:pPr>
-      <w:bookmarkStart w:id="85" w:name="_Toc213942515"/>
+      <w:bookmarkStart w:id="86" w:name="_Toc214019512"/>
       <w:r>
         <w:t>Third party bejelentkezés, és JWT szolgáltatás</w:t>
       </w:r>
-      <w:bookmarkEnd w:id="85"/>
+      <w:bookmarkEnd w:id="86"/>
     </w:p>
     <w:p>
       <w:r>
@@ -10530,8 +10726,8 @@
         <w:t>Az autentikációs folyamat két részre bontható. A ritkábban használt rész maga a külső fél általi autentikáció, majd a beléptetés vagy regisztráció. Ezt követően a bejelentkezett felhasználó már a másik folyamatot, a belső autentikációt használja mindaddig, amíg explicit módon ki nem lép az alkalmazásból. Ezt a belső autentikációt a JWT (JSON Web Token) alapú szolgáltatás valósítja meg. Amennyiben a felhasználó be van jelentkezve, az alkalmazás minden indításakor a kijelentkezésig, JWT tokennel történik a hitelesítése. Az alábbiakban bemutatom a két folyamat működését részletesen.</w:t>
       </w:r>
     </w:p>
-    <w:bookmarkStart w:id="86" w:name="_MON_1824541523"/>
-    <w:bookmarkEnd w:id="86"/>
+    <w:bookmarkStart w:id="87" w:name="_MON_1824541523"/>
+    <w:bookmarkEnd w:id="87"/>
     <w:p>
       <w:pPr>
         <w:keepNext/>
@@ -10542,11 +10738,11 @@
           <v:shape id="_x0000_i1035" type="#_x0000_t75" style="width:453.6pt;height:190.95pt" o:ole="">
             <v:imagedata r:id="rId45" o:title=""/>
           </v:shape>
-          <o:OLEObject Type="Embed" ProgID="Word.OpenDocumentText.12" ShapeID="_x0000_i1035" DrawAspect="Content" ObjectID="_1824555442" r:id="rId46"/>
+          <o:OLEObject Type="Embed" ProgID="Word.OpenDocumentText.12" ShapeID="_x0000_i1035" DrawAspect="Content" ObjectID="_1824632437" r:id="rId46"/>
         </w:object>
       </w:r>
     </w:p>
-    <w:bookmarkStart w:id="87" w:name="_Ref213929491"/>
+    <w:bookmarkStart w:id="88" w:name="_Ref213929491"/>
     <w:p>
       <w:pPr>
         <w:pStyle w:val="Kpalrs"/>
@@ -10572,12 +10768,15 @@
       <w:r>
         <w:t>. ábra</w:t>
       </w:r>
-      <w:bookmarkEnd w:id="87"/>
+      <w:bookmarkEnd w:id="88"/>
       <w:r>
         <w:t xml:space="preserve"> </w:t>
       </w:r>
       <w:r>
-        <w:t>Külső autentikációs API-függvények fejlécei</w:t>
+        <w:t>Külső autentikációhoz használt</w:t>
+      </w:r>
+      <w:r>
+        <w:t xml:space="preserve"> API-függvények fejlécei</w:t>
       </w:r>
     </w:p>
     <w:p>
@@ -10678,8 +10877,8 @@
         <w:t xml:space="preserve"> végpontok valamelyikét, amely paraméterként megkapja a felhasználónevet, az országot és az ideiglenes azonosítót. Ezek hiányában a backend elutasítja a regisztrációs kérelmet. Sikeres regisztráció esetén a felhasználó bekerül az adatbázisba, és kap egy JWT-tokent, amellyel a későbbiekben már a belső autentikációs folyamaton keresztül azonosítja magát.</w:t>
       </w:r>
     </w:p>
-    <w:bookmarkStart w:id="88" w:name="_MON_1824543082"/>
-    <w:bookmarkEnd w:id="88"/>
+    <w:bookmarkStart w:id="89" w:name="_MON_1824543082"/>
+    <w:bookmarkEnd w:id="89"/>
     <w:p>
       <w:pPr>
         <w:keepNext/>
@@ -10690,11 +10889,11 @@
           <v:shape id="_x0000_i1036" type="#_x0000_t75" style="width:453.6pt;height:242.85pt" o:ole="">
             <v:imagedata r:id="rId47" o:title=""/>
           </v:shape>
-          <o:OLEObject Type="Embed" ProgID="Word.OpenDocumentText.12" ShapeID="_x0000_i1036" DrawAspect="Content" ObjectID="_1824555443" r:id="rId48"/>
+          <o:OLEObject Type="Embed" ProgID="Word.OpenDocumentText.12" ShapeID="_x0000_i1036" DrawAspect="Content" ObjectID="_1824632438" r:id="rId48"/>
         </w:object>
       </w:r>
     </w:p>
-    <w:bookmarkStart w:id="89" w:name="_Ref213930414"/>
+    <w:bookmarkStart w:id="90" w:name="_Ref213930414"/>
     <w:p>
       <w:pPr>
         <w:pStyle w:val="Kpalrs"/>
@@ -10720,7 +10919,7 @@
       <w:r>
         <w:t>. ábra</w:t>
       </w:r>
-      <w:bookmarkEnd w:id="89"/>
+      <w:bookmarkEnd w:id="90"/>
       <w:r>
         <w:t xml:space="preserve"> Google autentikáció regisztrációs folyamat</w:t>
       </w:r>
@@ -10777,8 +10976,8 @@
         <w:t>A külső bejelentkezés után a felhasználó telefonján már megtalálható a JWT-token, így a továbbiakban azon keresztül azonosítja magát az alkalmazás indításakor. Ez a felhasználó számára láthatatlan, automatikus beléptetést jelent.</w:t>
       </w:r>
     </w:p>
-    <w:bookmarkStart w:id="90" w:name="_MON_1824545008"/>
-    <w:bookmarkEnd w:id="90"/>
+    <w:bookmarkStart w:id="91" w:name="_MON_1824545008"/>
+    <w:bookmarkEnd w:id="91"/>
     <w:p>
       <w:pPr>
         <w:keepNext/>
@@ -10789,11 +10988,11 @@
           <v:shape id="_x0000_i1037" type="#_x0000_t75" style="width:453.6pt;height:262.8pt" o:ole="">
             <v:imagedata r:id="rId49" o:title=""/>
           </v:shape>
-          <o:OLEObject Type="Embed" ProgID="Word.OpenDocumentText.12" ShapeID="_x0000_i1037" DrawAspect="Content" ObjectID="_1824555444" r:id="rId50"/>
+          <o:OLEObject Type="Embed" ProgID="Word.OpenDocumentText.12" ShapeID="_x0000_i1037" DrawAspect="Content" ObjectID="_1824632439" r:id="rId50"/>
         </w:object>
       </w:r>
     </w:p>
-    <w:bookmarkStart w:id="91" w:name="_Ref213932278"/>
+    <w:bookmarkStart w:id="92" w:name="_Ref213932278"/>
     <w:p>
       <w:pPr>
         <w:pStyle w:val="Kpalrs"/>
@@ -10819,7 +11018,7 @@
       <w:r>
         <w:t>. ábra</w:t>
       </w:r>
-      <w:bookmarkEnd w:id="91"/>
+      <w:bookmarkEnd w:id="92"/>
       <w:r>
         <w:t xml:space="preserve"> JWT-token generáló függvény</w:t>
       </w:r>
@@ -10829,8 +11028,8 @@
         <w:t>A külső beléptetés során használt JWT-token generáló függvényt a 24. ábra szemlélteti. A JWT-tokenekbe állításokat ágyazhatunk, jelen esetben a felhasználó adatait. Ezután létrehozunk egy aláírást, amelyet saját privát kulcsunkkal kódolunk. Ezt követően kiállítjuk az általunk aláírt JWT-tokent. Az így kiállított, titkosított tokent visszafejtve megkaphatjuk a hordozott hiteles állításokat, amelyeket felhasználhatunk a bejelentkezés során. A tokenekhez lejárati dátumot is rendelhetünk, amely után érvényüket vesztik; az én implementációmban ez egy év a kiállítás után. Üzleti programokban a biztonság miatt ez sokkal rövidebb, és a munkamenet közben gyakran frissítik.</w:t>
       </w:r>
     </w:p>
-    <w:bookmarkStart w:id="92" w:name="_MON_1824546018"/>
-    <w:bookmarkEnd w:id="92"/>
+    <w:bookmarkStart w:id="93" w:name="_MON_1824546018"/>
+    <w:bookmarkEnd w:id="93"/>
     <w:p>
       <w:pPr>
         <w:keepNext/>
@@ -10841,11 +11040,11 @@
           <v:shape id="_x0000_i1038" type="#_x0000_t75" style="width:453.6pt;height:196.55pt" o:ole="">
             <v:imagedata r:id="rId51" o:title=""/>
           </v:shape>
-          <o:OLEObject Type="Embed" ProgID="Word.OpenDocumentText.12" ShapeID="_x0000_i1038" DrawAspect="Content" ObjectID="_1824555445" r:id="rId52"/>
+          <o:OLEObject Type="Embed" ProgID="Word.OpenDocumentText.12" ShapeID="_x0000_i1038" DrawAspect="Content" ObjectID="_1824632440" r:id="rId52"/>
         </w:object>
       </w:r>
     </w:p>
-    <w:bookmarkStart w:id="93" w:name="_Ref213933435"/>
+    <w:bookmarkStart w:id="94" w:name="_Ref213933435"/>
     <w:p>
       <w:pPr>
         <w:pStyle w:val="Kpalrs"/>
@@ -10871,7 +11070,7 @@
       <w:r>
         <w:t>. ábra</w:t>
       </w:r>
-      <w:bookmarkEnd w:id="93"/>
+      <w:bookmarkEnd w:id="94"/>
       <w:r>
         <w:t xml:space="preserve"> ASP.NET Core beépített autentikáció konfigurációja</w:t>
       </w:r>
@@ -10938,8 +11137,8 @@
         <w:t xml:space="preserve"> függvénnyel hozzáadjuk az engedélyezés szolgáltatását, hogy a végpontok elérhetőségét az autentikáció eredménye alapján lehessen szabályozni.</w:t>
       </w:r>
     </w:p>
-    <w:bookmarkStart w:id="94" w:name="_MON_1824546952"/>
-    <w:bookmarkEnd w:id="94"/>
+    <w:bookmarkStart w:id="95" w:name="_MON_1824546952"/>
+    <w:bookmarkEnd w:id="95"/>
     <w:p>
       <w:pPr>
         <w:keepNext/>
@@ -10950,11 +11149,11 @@
           <v:shape id="_x0000_i1039" type="#_x0000_t75" style="width:453.6pt;height:207.6pt" o:ole="">
             <v:imagedata r:id="rId53" o:title=""/>
           </v:shape>
-          <o:OLEObject Type="Embed" ProgID="Word.OpenDocumentText.12" ShapeID="_x0000_i1039" DrawAspect="Content" ObjectID="_1824555446" r:id="rId54"/>
+          <o:OLEObject Type="Embed" ProgID="Word.OpenDocumentText.12" ShapeID="_x0000_i1039" DrawAspect="Content" ObjectID="_1824632441" r:id="rId54"/>
         </w:object>
       </w:r>
     </w:p>
-    <w:bookmarkStart w:id="95" w:name="_Ref213934154"/>
+    <w:bookmarkStart w:id="96" w:name="_Ref213934154"/>
     <w:p>
       <w:pPr>
         <w:pStyle w:val="Kpalrs"/>
@@ -10980,7 +11179,7 @@
       <w:r>
         <w:t>. ábra</w:t>
       </w:r>
-      <w:bookmarkEnd w:id="95"/>
+      <w:bookmarkEnd w:id="96"/>
       <w:r>
         <w:t xml:space="preserve"> Az aktuális felhasználó lekérése authorizációval</w:t>
       </w:r>
@@ -11061,19 +11260,19 @@
       <w:pPr>
         <w:pStyle w:val="Cmsor3"/>
       </w:pPr>
-      <w:bookmarkStart w:id="96" w:name="_Toc213942516"/>
+      <w:bookmarkStart w:id="97" w:name="_Toc214019513"/>
       <w:r>
         <w:t>Generikus CRUD</w:t>
       </w:r>
-      <w:bookmarkEnd w:id="96"/>
+      <w:bookmarkEnd w:id="97"/>
     </w:p>
     <w:p>
       <w:r>
         <w:t>A fejlesztés során fontos szempont volt számomra, hogy minimalizáljam a felesleges ismétlődő munkát: ahol ugyanaz a logika, ott ne írjam meg többször, mert ez időigényes, és növeli a hibalehetőséget. Ezért használtam ki a generikus osztályok és függvények előnyeit, így sikerült egy nagy, logikailag összefüggő részt általánosítani, és az új CRUD-műveletek létrehozását adott adatbázisosztályokra framework-szerűen megvalósítani.</w:t>
       </w:r>
     </w:p>
-    <w:bookmarkStart w:id="97" w:name="_MON_1824548970"/>
-    <w:bookmarkEnd w:id="97"/>
+    <w:bookmarkStart w:id="98" w:name="_MON_1824548970"/>
+    <w:bookmarkEnd w:id="98"/>
     <w:p>
       <w:pPr>
         <w:keepNext/>
@@ -11084,11 +11283,11 @@
           <v:shape id="_x0000_i1040" type="#_x0000_t75" style="width:453.6pt;height:53.05pt" o:ole="">
             <v:imagedata r:id="rId55" o:title=""/>
           </v:shape>
-          <o:OLEObject Type="Embed" ProgID="Word.OpenDocumentText.12" ShapeID="_x0000_i1040" DrawAspect="Content" ObjectID="_1824555447" r:id="rId56"/>
+          <o:OLEObject Type="Embed" ProgID="Word.OpenDocumentText.12" ShapeID="_x0000_i1040" DrawAspect="Content" ObjectID="_1824632442" r:id="rId56"/>
         </w:object>
       </w:r>
     </w:p>
-    <w:bookmarkStart w:id="98" w:name="_Ref213936030"/>
+    <w:bookmarkStart w:id="99" w:name="_Ref213936030"/>
     <w:p>
       <w:pPr>
         <w:pStyle w:val="Kpalrs"/>
@@ -11114,7 +11313,7 @@
       <w:r>
         <w:t>. ábra</w:t>
       </w:r>
-      <w:bookmarkEnd w:id="98"/>
+      <w:bookmarkEnd w:id="99"/>
       <w:r>
         <w:t xml:space="preserve"> Entitás osztályok megvalósítandó interfésze</w:t>
       </w:r>
@@ -11160,8 +11359,8 @@
         <w:t>-hez, amely bármilyen típusú lehet, mégis hozzá tudok férni.</w:t>
       </w:r>
     </w:p>
-    <w:bookmarkStart w:id="99" w:name="_MON_1824549910"/>
-    <w:bookmarkEnd w:id="99"/>
+    <w:bookmarkStart w:id="100" w:name="_MON_1824549910"/>
+    <w:bookmarkEnd w:id="100"/>
     <w:p>
       <w:pPr>
         <w:keepNext/>
@@ -11172,11 +11371,11 @@
           <v:shape id="_x0000_i1041" type="#_x0000_t75" style="width:453.6pt;height:108.25pt" o:ole="">
             <v:imagedata r:id="rId57" o:title=""/>
           </v:shape>
-          <o:OLEObject Type="Embed" ProgID="Word.OpenDocumentText.12" ShapeID="_x0000_i1041" DrawAspect="Content" ObjectID="_1824555448" r:id="rId58"/>
+          <o:OLEObject Type="Embed" ProgID="Word.OpenDocumentText.12" ShapeID="_x0000_i1041" DrawAspect="Content" ObjectID="_1824632443" r:id="rId58"/>
         </w:object>
       </w:r>
     </w:p>
-    <w:bookmarkStart w:id="100" w:name="_Ref213936954"/>
+    <w:bookmarkStart w:id="101" w:name="_Ref213936954"/>
     <w:p>
       <w:pPr>
         <w:pStyle w:val="Kpalrs"/>
@@ -11202,7 +11401,7 @@
       <w:r>
         <w:t>. ábra</w:t>
       </w:r>
-      <w:bookmarkEnd w:id="100"/>
+      <w:bookmarkEnd w:id="101"/>
       <w:r>
         <w:t xml:space="preserve"> Generikus csak olvasható repository interfész</w:t>
       </w:r>
@@ -11339,8 +11538,8 @@
         <w:t>-ba.</w:t>
       </w:r>
     </w:p>
-    <w:bookmarkStart w:id="101" w:name="_MON_1824551134"/>
-    <w:bookmarkEnd w:id="101"/>
+    <w:bookmarkStart w:id="102" w:name="_MON_1824551134"/>
+    <w:bookmarkEnd w:id="102"/>
     <w:p>
       <w:pPr>
         <w:keepNext/>
@@ -11351,7 +11550,7 @@
           <v:shape id="_x0000_i1042" type="#_x0000_t75" style="width:453.6pt;height:152.4pt" o:ole="">
             <v:imagedata r:id="rId59" o:title=""/>
           </v:shape>
-          <o:OLEObject Type="Embed" ProgID="Word.OpenDocumentText.12" ShapeID="_x0000_i1042" DrawAspect="Content" ObjectID="_1824555449" r:id="rId60"/>
+          <o:OLEObject Type="Embed" ProgID="Word.OpenDocumentText.12" ShapeID="_x0000_i1042" DrawAspect="Content" ObjectID="_1824632444" r:id="rId60"/>
         </w:object>
       </w:r>
     </w:p>
@@ -11359,27 +11558,14 @@
       <w:pPr>
         <w:pStyle w:val="Kpalrs"/>
       </w:pPr>
-      <w:r>
-        <w:fldChar w:fldCharType="begin"/>
-      </w:r>
-      <w:r>
-        <w:instrText xml:space="preserve"> SEQ ábra \* ARABIC </w:instrText>
-      </w:r>
-      <w:r>
-        <w:fldChar w:fldCharType="separate"/>
-      </w:r>
-      <w:r>
-        <w:rPr>
-          <w:noProof/>
-        </w:rPr>
-        <w:t>29</w:t>
-      </w:r>
-      <w:r>
-        <w:rPr>
-          <w:noProof/>
-        </w:rPr>
-        <w:fldChar w:fldCharType="end"/>
-      </w:r>
+      <w:fldSimple w:instr=" SEQ ábra \* ARABIC ">
+        <w:r>
+          <w:rPr>
+            <w:noProof/>
+          </w:rPr>
+          <w:t>29</w:t>
+        </w:r>
+      </w:fldSimple>
       <w:r>
         <w:t>. ábra Generikus</w:t>
       </w:r>
@@ -11470,8 +11656,8 @@
         <w:t>A fent bemutatott generikus interfészeknek elkészültek a generikus implementáció, ugyanis így minden adott ahhoz, hogy akkor az implementáció is generikus legyen. Csupán egy valami szügséges minden különböző entitás repository implementációjakor. Egy Map függvény.</w:t>
       </w:r>
     </w:p>
-    <w:bookmarkStart w:id="102" w:name="_MON_1824552060"/>
-    <w:bookmarkEnd w:id="102"/>
+    <w:bookmarkStart w:id="103" w:name="_MON_1824552060"/>
+    <w:bookmarkEnd w:id="103"/>
     <w:p>
       <w:pPr>
         <w:keepNext/>
@@ -11482,11 +11668,11 @@
           <v:shape id="_x0000_i1043" type="#_x0000_t75" style="width:453.6pt;height:53.9pt" o:ole="">
             <v:imagedata r:id="rId61" o:title=""/>
           </v:shape>
-          <o:OLEObject Type="Embed" ProgID="Word.OpenDocumentText.12" ShapeID="_x0000_i1043" DrawAspect="Content" ObjectID="_1824555450" r:id="rId62"/>
+          <o:OLEObject Type="Embed" ProgID="Word.OpenDocumentText.12" ShapeID="_x0000_i1043" DrawAspect="Content" ObjectID="_1824632445" r:id="rId62"/>
         </w:object>
       </w:r>
     </w:p>
-    <w:bookmarkStart w:id="103" w:name="_Ref213939185"/>
+    <w:bookmarkStart w:id="104" w:name="_Ref213939185"/>
     <w:p>
       <w:pPr>
         <w:pStyle w:val="Kpalrs"/>
@@ -11512,7 +11698,7 @@
       <w:r>
         <w:t>. ábra</w:t>
       </w:r>
-      <w:bookmarkEnd w:id="103"/>
+      <w:bookmarkEnd w:id="104"/>
       <w:r>
         <w:t xml:space="preserve"> Leképező függvények</w:t>
       </w:r>
@@ -11649,8 +11835,8 @@
         <w:t>Ha egy adott repository-nak a CRUD műveleteken túl további, speciális adatbázis-függvényeket kell megvalósítania, akkor az interfészét leszármaztatjuk valamelyik generikus repository interfészből. A saját interfészben definiáljuk a szükséges extra függvényeket, majd a konkrét repository implementációban valósítjuk meg ezeket a leképező függvényekkel együtt.</w:t>
       </w:r>
     </w:p>
-    <w:bookmarkStart w:id="104" w:name="_MON_1824553195"/>
-    <w:bookmarkEnd w:id="104"/>
+    <w:bookmarkStart w:id="105" w:name="_MON_1824553195"/>
+    <w:bookmarkEnd w:id="105"/>
     <w:p>
       <w:pPr>
         <w:keepNext/>
@@ -11661,11 +11847,11 @@
           <v:shape id="_x0000_i1044" type="#_x0000_t75" style="width:453.6pt;height:97.2pt" o:ole="">
             <v:imagedata r:id="rId63" o:title=""/>
           </v:shape>
-          <o:OLEObject Type="Embed" ProgID="Word.OpenDocumentText.12" ShapeID="_x0000_i1044" DrawAspect="Content" ObjectID="_1824555451" r:id="rId64"/>
+          <o:OLEObject Type="Embed" ProgID="Word.OpenDocumentText.12" ShapeID="_x0000_i1044" DrawAspect="Content" ObjectID="_1824632446" r:id="rId64"/>
         </w:object>
       </w:r>
     </w:p>
-    <w:bookmarkStart w:id="105" w:name="_Ref213940420"/>
+    <w:bookmarkStart w:id="106" w:name="_Ref213940420"/>
     <w:p>
       <w:pPr>
         <w:pStyle w:val="Kpalrs"/>
@@ -11691,7 +11877,7 @@
       <w:r>
         <w:t>. ábra</w:t>
       </w:r>
-      <w:bookmarkEnd w:id="105"/>
+      <w:bookmarkEnd w:id="106"/>
       <w:r>
         <w:t xml:space="preserve"> Generikus kontroller osztály</w:t>
       </w:r>
@@ -11737,8 +11923,8 @@
         <w:t xml:space="preserve"> osztályon keresztül. Ez a kontroller a generikus függvényeket hívja meg az adott végponthoz tartozó logika szerint; hiba esetén a megfelelő hibát dobja, egyébként elvégzi a műveletet és sikeres jelzést ad.</w:t>
       </w:r>
     </w:p>
-    <w:bookmarkStart w:id="106" w:name="_MON_1824553741"/>
-    <w:bookmarkEnd w:id="106"/>
+    <w:bookmarkStart w:id="107" w:name="_MON_1824553741"/>
+    <w:bookmarkEnd w:id="107"/>
     <w:p>
       <w:pPr>
         <w:keepNext/>
@@ -11749,11 +11935,11 @@
           <v:shape id="_x0000_i1045" type="#_x0000_t75" style="width:453.6pt;height:108.25pt" o:ole="">
             <v:imagedata r:id="rId65" o:title=""/>
           </v:shape>
-          <o:OLEObject Type="Embed" ProgID="Word.OpenDocumentText.12" ShapeID="_x0000_i1045" DrawAspect="Content" ObjectID="_1824555452" r:id="rId66"/>
+          <o:OLEObject Type="Embed" ProgID="Word.OpenDocumentText.12" ShapeID="_x0000_i1045" DrawAspect="Content" ObjectID="_1824632447" r:id="rId66"/>
         </w:object>
       </w:r>
     </w:p>
-    <w:bookmarkStart w:id="107" w:name="_Ref213940613"/>
+    <w:bookmarkStart w:id="108" w:name="_Ref213940613"/>
     <w:p>
       <w:pPr>
         <w:pStyle w:val="Kpalrs"/>
@@ -11779,7 +11965,7 @@
       <w:r>
         <w:t>. ábra</w:t>
       </w:r>
-      <w:bookmarkEnd w:id="107"/>
+      <w:bookmarkEnd w:id="108"/>
       <w:r>
         <w:t xml:space="preserve"> Egyszerű kontroller implementáció</w:t>
       </w:r>
@@ -11835,9 +12021,9 @@
         <mc:AlternateContent>
           <mc:Choice Requires="wpg">
             <w:drawing>
-              <wp:inline distT="0" distB="0" distL="0" distR="0" wp14:anchorId="57CAE4BD" wp14:editId="7ABD771E">
-                <wp:extent cx="5387478" cy="4360711"/>
-                <wp:effectExtent l="0" t="0" r="22860" b="20955"/>
+              <wp:inline distT="0" distB="0" distL="0" distR="0" wp14:anchorId="57CAE4BD" wp14:editId="7AA5F1A0">
+                <wp:extent cx="5387478" cy="4381500"/>
+                <wp:effectExtent l="0" t="0" r="22860" b="19050"/>
                 <wp:docPr id="31" name="Csoportba foglalás 31"/>
                 <wp:cNvGraphicFramePr/>
                 <a:graphic xmlns:a="http://schemas.openxmlformats.org/drawingml/2006/main">
@@ -11847,9 +12033,9 @@
                       <wpg:grpSpPr>
                         <a:xfrm>
                           <a:off x="0" y="0"/>
-                          <a:ext cx="5387478" cy="4360711"/>
+                          <a:ext cx="5387478" cy="4381500"/>
                           <a:chOff x="0" y="0"/>
-                          <a:chExt cx="5387478" cy="4360711"/>
+                          <a:chExt cx="5387478" cy="4381500"/>
                         </a:xfrm>
                       </wpg:grpSpPr>
                       <wps:wsp>
@@ -12069,8 +12255,8 @@
                         </wps:cNvSpPr>
                         <wps:spPr bwMode="auto">
                           <a:xfrm>
-                            <a:off x="0" y="3570136"/>
-                            <a:ext cx="2199005" cy="790575"/>
+                            <a:off x="0" y="3570000"/>
+                            <a:ext cx="2199005" cy="811500"/>
                           </a:xfrm>
                           <a:prstGeom prst="rect">
                             <a:avLst/>
@@ -12248,7 +12434,7 @@
           </mc:Choice>
           <mc:Fallback>
             <w:pict>
-              <v:group w14:anchorId="57CAE4BD" id="Csoportba foglalás 31" o:spid="_x0000_s1028" style="width:424.2pt;height:343.35pt;mso-position-horizontal-relative:char;mso-position-vertical-relative:line" coordsize="53874,43607" o:gfxdata="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">
+              <v:group w14:anchorId="57CAE4BD" id="Csoportba foglalás 31" o:spid="_x0000_s1028" style="width:424.2pt;height:345pt;mso-position-horizontal-relative:char;mso-position-vertical-relative:line" coordsize="53874,43815" o:gfxdata="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">
                 <v:shape id="Szövegdoboz 2" o:spid="_x0000_s1029" type="#_x0000_t202" style="position:absolute;width:22002;height:10477;visibility:visible;mso-wrap-style:square;v-text-anchor:top" o:gfxdata="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">
                   <v:textbox>
                     <w:txbxContent>
@@ -12260,25 +12446,21 @@
                         <w:r>
                           <w:t xml:space="preserve">Létrehozzuk az osztályokat, és meghatározzuk az adott entitás-osztály </w:t>
                         </w:r>
-                        <w:proofErr w:type="spellStart"/>
                         <w:r>
                           <w:rPr>
                             <w:i/>
                           </w:rPr>
                           <w:t>Provided</w:t>
                         </w:r>
-                        <w:proofErr w:type="spellEnd"/>
                         <w:r>
                           <w:t xml:space="preserve"> és </w:t>
                         </w:r>
-                        <w:proofErr w:type="spellStart"/>
                         <w:r>
                           <w:rPr>
                             <w:i/>
                           </w:rPr>
                           <w:t>Required</w:t>
                         </w:r>
-                        <w:proofErr w:type="spellEnd"/>
                         <w:r>
                           <w:t xml:space="preserve"> változatának tartalmát.</w:t>
                         </w:r>
@@ -12295,59 +12477,31 @@
                           <w:jc w:val="left"/>
                         </w:pPr>
                         <w:r>
-                          <w:t xml:space="preserve">Létrehozzuk a </w:t>
-                        </w:r>
-                        <w:proofErr w:type="gramStart"/>
-                        <w:r>
-                          <w:t>konkrét</w:t>
-                        </w:r>
-                        <w:proofErr w:type="gramEnd"/>
-                        <w:r>
-                          <w:t xml:space="preserve"> adatbázis-entitásho</w:t>
+                          <w:t>Létrehozzuk a konkrét adatbázis-entitásho</w:t>
                         </w:r>
                         <w:r>
-                          <w:t xml:space="preserve">z tartozó </w:t>
+                          <w:t xml:space="preserve">z tartozó repository interfészt, amit leszármaztatunk az </w:t>
                         </w:r>
-                        <w:proofErr w:type="spellStart"/>
-                        <w:r>
-                          <w:t>repository</w:t>
-                        </w:r>
-                        <w:proofErr w:type="spellEnd"/>
-                        <w:r>
-                          <w:t xml:space="preserve"> interfészt, amit leszármaztatunk az </w:t>
-                        </w:r>
-                        <w:proofErr w:type="spellStart"/>
                         <w:r>
                           <w:rPr>
                             <w:i/>
                           </w:rPr>
                           <w:t>IReadOnlyGenericRepository</w:t>
                         </w:r>
-                        <w:proofErr w:type="spellEnd"/>
                         <w:r>
                           <w:t xml:space="preserve"> vagy az </w:t>
                         </w:r>
-                        <w:proofErr w:type="spellStart"/>
                         <w:r>
                           <w:rPr>
                             <w:i/>
                           </w:rPr>
                           <w:t>IGenericRepository</w:t>
                         </w:r>
-                        <w:proofErr w:type="spellEnd"/>
                         <w:r>
                           <w:t xml:space="preserve"> interfészből.</w:t>
                         </w:r>
                         <w:r>
-                          <w:t xml:space="preserve"> Ha csak </w:t>
-                        </w:r>
-                        <w:proofErr w:type="spellStart"/>
-                        <w:r>
-                          <w:t>read-only</w:t>
-                        </w:r>
-                        <w:proofErr w:type="spellEnd"/>
-                        <w:r>
-                          <w:t>, és nem szükséges plusz függvény, akkor ez nem kötelező.</w:t>
+                          <w:t xml:space="preserve"> Ha csak read-only, és nem szükséges plusz függvény, akkor ez nem kötelező.</w:t>
                         </w:r>
                       </w:p>
                     </w:txbxContent>
@@ -12362,47 +12516,7 @@
                           <w:jc w:val="left"/>
                         </w:pPr>
                         <w:r>
-                          <w:t xml:space="preserve">Létrehozzuk a </w:t>
-                        </w:r>
-                        <w:proofErr w:type="gramStart"/>
-                        <w:r>
-                          <w:t>konkrét</w:t>
-                        </w:r>
-                        <w:proofErr w:type="gramEnd"/>
-                        <w:r>
-                          <w:t xml:space="preserve"> implementációját a </w:t>
-                        </w:r>
-                        <w:proofErr w:type="spellStart"/>
-                        <w:r>
-                          <w:t>repository-nak</w:t>
-                        </w:r>
-                        <w:proofErr w:type="spellEnd"/>
-                        <w:r>
-                          <w:t xml:space="preserve">, leszármaztatjuk valamely </w:t>
-                        </w:r>
-                        <w:proofErr w:type="spellStart"/>
-                        <w:r>
-                          <w:t>repository</w:t>
-                        </w:r>
-                        <w:proofErr w:type="spellEnd"/>
-                        <w:r>
-                          <w:t xml:space="preserve"> interfészhez tartozó osztályból, és megvalósítjuk a </w:t>
-                        </w:r>
-                        <w:proofErr w:type="spellStart"/>
-                        <w:r>
-                          <w:t>leképező</w:t>
-                        </w:r>
-                        <w:proofErr w:type="spellEnd"/>
-                        <w:r>
-                          <w:t xml:space="preserve"> </w:t>
-                        </w:r>
-                        <w:proofErr w:type="spellStart"/>
-                        <w:r>
-                          <w:t>függvényket</w:t>
-                        </w:r>
-                        <w:proofErr w:type="spellEnd"/>
-                        <w:r>
-                          <w:t xml:space="preserve"> plusz opcionális függvényket.</w:t>
+                          <w:t>Létrehozzuk a konkrét implementációját a repository-nak, leszármaztatjuk valamely repository interfészhez tartozó osztályból, és megvalósítjuk a leképező függvényket plusz opcionális függvényket.</w:t>
                         </w:r>
                       </w:p>
                     </w:txbxContent>
@@ -12423,7 +12537,7 @@
                     </w:txbxContent>
                   </v:textbox>
                 </v:shape>
-                <v:shape id="Szövegdoboz 2" o:spid="_x0000_s1033" type="#_x0000_t202" style="position:absolute;top:35701;width:21990;height:7906;visibility:visible;mso-wrap-style:square;v-text-anchor:top" o:gfxdata="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">
+                <v:shape id="Szövegdoboz 2" o:spid="_x0000_s1033" type="#_x0000_t202" style="position:absolute;top:35700;width:21990;height:8115;visibility:visible;mso-wrap-style:square;v-text-anchor:top" o:gfxdata="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">
                   <v:textbox>
                     <w:txbxContent>
                       <w:p>
@@ -12432,23 +12546,7 @@
                           <w:jc w:val="left"/>
                         </w:pPr>
                         <w:r>
-                          <w:t xml:space="preserve">Az interfész implementációját </w:t>
-                        </w:r>
-                        <w:proofErr w:type="spellStart"/>
-                        <w:r>
-                          <w:t>dependency</w:t>
-                        </w:r>
-                        <w:proofErr w:type="spellEnd"/>
-                        <w:r>
-                          <w:t xml:space="preserve"> </w:t>
-                        </w:r>
-                        <w:proofErr w:type="spellStart"/>
-                        <w:r>
-                          <w:t>injection</w:t>
-                        </w:r>
-                        <w:proofErr w:type="spellEnd"/>
-                        <w:r>
-                          <w:t xml:space="preserve"> segítségével adjuk meg.</w:t>
+                          <w:t>Az interfész implementációját dependency injection segítségével adjuk meg.</w:t>
                         </w:r>
                       </w:p>
                     </w:txbxContent>
@@ -12478,6 +12576,672 @@
       </w:r>
     </w:p>
     <w:p/>
+    <w:p>
+      <w:pPr>
+        <w:pStyle w:val="Cmsor2"/>
+      </w:pPr>
+      <w:bookmarkStart w:id="109" w:name="_Toc214019514"/>
+      <w:r>
+        <w:t>React Native</w:t>
+      </w:r>
+      <w:bookmarkEnd w:id="109"/>
+    </w:p>
+    <w:p>
+      <w:pPr>
+        <w:pStyle w:val="Cmsor3"/>
+      </w:pPr>
+      <w:bookmarkStart w:id="110" w:name="_Toc214019515"/>
+      <w:r>
+        <w:t>Expo app.json</w:t>
+      </w:r>
+      <w:bookmarkEnd w:id="110"/>
+    </w:p>
+    <w:p>
+      <w:r>
+        <w:t xml:space="preserve">A </w:t>
+      </w:r>
+      <w:hyperlink w:anchor="_Expo" w:history="1">
+        <w:r>
+          <w:rPr>
+            <w:rStyle w:val="Hiperhivatkozs"/>
+          </w:rPr>
+          <w:t>2.4.2</w:t>
+        </w:r>
+      </w:hyperlink>
+      <w:r>
+        <w:t>-es fejezetben már ismertettem az Expo e</w:t>
+      </w:r>
+      <w:r>
+        <w:t>szköztárat</w:t>
+      </w:r>
+      <w:r>
+        <w:t>. Az eg</w:t>
+      </w:r>
+      <w:r>
+        <w:t>yik leghasznosabb tulajdonsága -</w:t>
+      </w:r>
+      <w:r>
+        <w:t xml:space="preserve"> amellyel sokat foglalkoztam </w:t>
+      </w:r>
+      <w:r>
+        <w:t>a megfelelő konfiguráció miatt -</w:t>
+      </w:r>
+      <w:r>
+        <w:t xml:space="preserve"> az </w:t>
+      </w:r>
+      <w:r>
+        <w:rPr>
+          <w:i/>
+        </w:rPr>
+        <w:t>app.json</w:t>
+      </w:r>
+      <w:r>
+        <w:t xml:space="preserve"> fájl. Ez egy központi konfigurációs állomány, amelyben egyszerre tudunk beállításokat megadni Androidra, iOS-re és webre. Ennek nagy előnye, hogy nem kell mindhárom platform konfigurációját külön-külön módosítani: ha az app.json-ben megadjuk a beállításokat, akkor a buildelés során automatikusan létrejönnek a megfelelő platformspecifikus konfigurációs fájlok. Emellett ebben a JSON-ben megadhatunk kizárólag egy adott platformra vonatkozó beállításokat is, így a teljes konfiguráció központilag, egyetlen helyen kezelhető.</w:t>
+      </w:r>
+    </w:p>
+    <w:bookmarkStart w:id="111" w:name="_MON_1824622691"/>
+    <w:bookmarkEnd w:id="111"/>
+    <w:p>
+      <w:pPr>
+        <w:keepNext/>
+        <w:ind w:firstLine="0"/>
+      </w:pPr>
+      <w:r>
+        <w:object w:dxaOrig="9072" w:dyaOrig="6885" w14:anchorId="3D056FAD">
+          <v:shape id="_x0000_i1046" type="#_x0000_t75" style="width:453.6pt;height:344.25pt" o:ole="">
+            <v:imagedata r:id="rId67" o:title=""/>
+          </v:shape>
+          <o:OLEObject Type="Embed" ProgID="Word.OpenDocumentText.12" ShapeID="_x0000_i1046" DrawAspect="Content" ObjectID="_1824632448" r:id="rId68"/>
+        </w:object>
+      </w:r>
+    </w:p>
+    <w:bookmarkStart w:id="112" w:name="_Ref214010571"/>
+    <w:p>
+      <w:pPr>
+        <w:pStyle w:val="Kpalrs"/>
+        <w:rPr>
+          <w:noProof/>
+        </w:rPr>
+      </w:pPr>
+      <w:r>
+        <w:fldChar w:fldCharType="begin"/>
+      </w:r>
+      <w:r>
+        <w:instrText xml:space="preserve"> SEQ ábra \* ARABIC </w:instrText>
+      </w:r>
+      <w:r>
+        <w:fldChar w:fldCharType="separate"/>
+      </w:r>
+      <w:r>
+        <w:rPr>
+          <w:noProof/>
+        </w:rPr>
+        <w:t>33</w:t>
+      </w:r>
+      <w:r>
+        <w:fldChar w:fldCharType="end"/>
+      </w:r>
+      <w:r>
+        <w:t>. ábra</w:t>
+      </w:r>
+      <w:bookmarkEnd w:id="112"/>
+      <w:r>
+        <w:t xml:space="preserve"> app.json android konfiguráció (részlet), alatta ugyanez az Android</w:t>
+      </w:r>
+      <w:r>
+        <w:rPr>
+          <w:noProof/>
+        </w:rPr>
+        <w:t>Manifest.xml fájlban</w:t>
+      </w:r>
+    </w:p>
+    <w:p>
+      <w:r>
+        <w:t xml:space="preserve">A 33. ábra mutatja a konfiguráció példáját. A felső kódrészlet a React Native projekt </w:t>
+      </w:r>
+      <w:r>
+        <w:rPr>
+          <w:i/>
+        </w:rPr>
+        <w:t>app.json</w:t>
+      </w:r>
+      <w:r>
+        <w:t xml:space="preserve"> fájljából származik, míg az alsó rész az Android build során automatikusan legenerált </w:t>
+      </w:r>
+      <w:r>
+        <w:rPr>
+          <w:i/>
+        </w:rPr>
+        <w:t>AndroidManifest.xml</w:t>
+      </w:r>
+      <w:r>
+        <w:t xml:space="preserve"> megfelelő szakasza. Jól látható, hogy a build folyamat az app.json-ben megadott beállítások alapján hozza létre az Android-specifikus konfigurációt: ugyanazok az intent filterek és adatsémák kerülnek átemelésre, amelyeket a központi konfigurációban meghatároztunk. A kód feladata, hogy az alkalmazás számára egyedi URL-sémákat (deep linkeket) definiáljon. Ennek segítségével a rendszer képes felismerni, h</w:t>
+      </w:r>
+      <w:r>
+        <w:t>a egy olyan linket nyitunk meg -</w:t>
+      </w:r>
+      <w:r>
+        <w:t xml:space="preserve"> p</w:t>
+      </w:r>
+      <w:r>
+        <w:t xml:space="preserve">éldául </w:t>
+      </w:r>
+      <w:r>
+        <w:rPr>
+          <w:i/>
+        </w:rPr>
+        <w:t>com.gelomelo.coffer://</w:t>
+      </w:r>
+      <w:r>
+        <w:t>… -</w:t>
+      </w:r>
+      <w:r>
+        <w:t xml:space="preserve"> amelyet az alkalmazásnak kell kezelnie, és automatikusan az appot indítja el a megfelelő képernyőre navigálva. Ez a mechanizmus teszi lehetővé többek között a külső autentikáció utáni visszairányítást vagy különböző mélylinkek kezelését.</w:t>
+      </w:r>
+    </w:p>
+    <w:p>
+      <w:pPr>
+        <w:pStyle w:val="Cmsor3"/>
+      </w:pPr>
+      <w:bookmarkStart w:id="113" w:name="_Toc214019516"/>
+      <w:r>
+        <w:lastRenderedPageBreak/>
+        <w:t>Expo router</w:t>
+      </w:r>
+      <w:bookmarkEnd w:id="113"/>
+    </w:p>
+    <w:p>
+      <w:r>
+        <w:t xml:space="preserve">Az Expo egyik nagy újítása a React Native hagyományos, bonyolultabb navigációs folyamatának jelentős leegyszerűsítése. A korábbi navigációs könyvtárak használata sok kézi konfigurációt igényelt: külön stackeket kellett definiálni, manuálisan kellett beállítani az útvonalakat, és konfigurálni a mélylinkeket az egyes oldalakhoz. Ezzel szemben az Expo Router használatával mindez lényegesen egyszerűbbé válik, mivel konvencióalapú megközelítést alkalmaz. Az Expo Router a </w:t>
+      </w:r>
+      <w:r>
+        <w:rPr>
+          <w:i/>
+        </w:rPr>
+        <w:t>/app</w:t>
+      </w:r>
+      <w:r>
+        <w:t xml:space="preserve"> mappát tekinti kiindulópontnak, és az ezen belül létrehozott fájlokhoz automatikusan útvonala</w:t>
+      </w:r>
+      <w:r>
+        <w:t xml:space="preserve">t rendel: például a </w:t>
+      </w:r>
+      <w:r>
+        <w:rPr>
+          <w:i/>
+        </w:rPr>
+        <w:t>/app/login.tsx</w:t>
+      </w:r>
+      <w:r>
+        <w:t xml:space="preserve"> fájl elérési</w:t>
+      </w:r>
+      <w:r>
+        <w:t xml:space="preserve"> útvonala automatikusan </w:t>
+      </w:r>
+      <w:r>
+        <w:rPr>
+          <w:i/>
+        </w:rPr>
+        <w:t>/login</w:t>
+      </w:r>
+      <w:r>
+        <w:t xml:space="preserve"> lesz. Ennek köszönhetően nincs szükség stackek és útvonalak kézi definiálására, mert a navigáció teljesen a mappa-struktúrára épül. Ez a megoldás sokkal átláthatóbbá és gyorsabbá teszi a fejlesztést, én pedig pontosan ezért ezt a módszert használtam.</w:t>
+      </w:r>
+    </w:p>
+    <w:p>
+      <w:pPr>
+        <w:keepNext/>
+        <w:jc w:val="center"/>
+      </w:pPr>
+      <w:r>
+        <w:rPr>
+          <w:noProof/>
+          <w:lang w:eastAsia="hu-HU"/>
+        </w:rPr>
+        <w:drawing>
+          <wp:inline distT="0" distB="0" distL="0" distR="0" wp14:anchorId="4CD047F2" wp14:editId="6D64DCFD">
+            <wp:extent cx="1571844" cy="2915057"/>
+            <wp:effectExtent l="0" t="0" r="9525" b="0"/>
+            <wp:docPr id="32" name="Kép 32"/>
+            <wp:cNvGraphicFramePr>
+              <a:graphicFrameLocks xmlns:a="http://schemas.openxmlformats.org/drawingml/2006/main" noChangeAspect="1"/>
+            </wp:cNvGraphicFramePr>
+            <a:graphic xmlns:a="http://schemas.openxmlformats.org/drawingml/2006/main">
+              <a:graphicData uri="http://schemas.openxmlformats.org/drawingml/2006/picture">
+                <pic:pic xmlns:pic="http://schemas.openxmlformats.org/drawingml/2006/picture">
+                  <pic:nvPicPr>
+                    <pic:cNvPr id="1" name=""/>
+                    <pic:cNvPicPr/>
+                  </pic:nvPicPr>
+                  <pic:blipFill>
+                    <a:blip r:embed="rId69"/>
+                    <a:stretch>
+                      <a:fillRect/>
+                    </a:stretch>
+                  </pic:blipFill>
+                  <pic:spPr>
+                    <a:xfrm>
+                      <a:off x="0" y="0"/>
+                      <a:ext cx="1571844" cy="2915057"/>
+                    </a:xfrm>
+                    <a:prstGeom prst="rect">
+                      <a:avLst/>
+                    </a:prstGeom>
+                  </pic:spPr>
+                </pic:pic>
+              </a:graphicData>
+            </a:graphic>
+          </wp:inline>
+        </w:drawing>
+      </w:r>
+    </w:p>
+    <w:bookmarkStart w:id="114" w:name="_Ref214011751"/>
+    <w:p>
+      <w:pPr>
+        <w:pStyle w:val="Kpalrs"/>
+      </w:pPr>
+      <w:r>
+        <w:fldChar w:fldCharType="begin"/>
+      </w:r>
+      <w:r>
+        <w:instrText xml:space="preserve"> SEQ ábra \* ARABIC </w:instrText>
+      </w:r>
+      <w:r>
+        <w:fldChar w:fldCharType="separate"/>
+      </w:r>
+      <w:r>
+        <w:rPr>
+          <w:noProof/>
+        </w:rPr>
+        <w:t>34</w:t>
+      </w:r>
+      <w:r>
+        <w:fldChar w:fldCharType="end"/>
+      </w:r>
+      <w:r>
+        <w:t>. ábra</w:t>
+      </w:r>
+      <w:bookmarkEnd w:id="114"/>
+      <w:r>
+        <w:t xml:space="preserve"> Expo router-hez használt mappastruktúra</w:t>
+      </w:r>
+    </w:p>
+    <w:p>
+      <w:r>
+        <w:t>A mappastruktúrát az oldalakhoz én is az Expo Router konvenciói alapján alakít</w:t>
+      </w:r>
+      <w:r>
+        <w:t xml:space="preserve">ottam ki, ahogyan azt a </w:t>
+      </w:r>
+      <w:r>
+        <w:fldChar w:fldCharType="begin"/>
+      </w:r>
+      <w:r>
+        <w:instrText xml:space="preserve"> REF _Ref214011751 \h </w:instrText>
+      </w:r>
+      <w:r>
+        <w:fldChar w:fldCharType="separate"/>
+      </w:r>
+      <w:r>
+        <w:rPr>
+          <w:noProof/>
+        </w:rPr>
+        <w:t>34</w:t>
+      </w:r>
+      <w:r>
+        <w:t>. ábra</w:t>
+      </w:r>
+      <w:r>
+        <w:fldChar w:fldCharType="end"/>
+      </w:r>
+      <w:r>
+        <w:t xml:space="preserve"> is szemlélteti. Az azonos mélységben található fájlok az alkalmazás útvonalai között is ugyanolyan mélységet képviselnek, de természetesen lehetőség van további beágyazásra. A projektben például az </w:t>
+      </w:r>
+      <w:r>
+        <w:rPr>
+          <w:i/>
+        </w:rPr>
+        <w:t>index.tsx</w:t>
+      </w:r>
+      <w:r>
+        <w:t xml:space="preserve"> és a </w:t>
+      </w:r>
+      <w:r>
+        <w:rPr>
+          <w:i/>
+        </w:rPr>
+        <w:t>login.tsx</w:t>
+      </w:r>
+      <w:r>
+        <w:t xml:space="preserve"> a gyökérszinten találhatóak, és ezek határozzák meg a kezdőoldalt, illetve a bejelentkező oldalt. Minden mappaszinten létrehozható egy </w:t>
+      </w:r>
+      <w:r>
+        <w:rPr>
+          <w:i/>
+        </w:rPr>
+        <w:t>_layout.tsx</w:t>
+      </w:r>
+      <w:r>
+        <w:t xml:space="preserve"> fájl, amely az adott szin</w:t>
+      </w:r>
+      <w:r>
+        <w:t>t alap struktúráját definiálja -</w:t>
+      </w:r>
+      <w:r>
+        <w:t xml:space="preserve"> például hogy legyen-e felső vagy alsó navigációs sáv. Ha egy mélységben nincs megadva, hogy pontosan melyik oldalra navigáljon, akkor </w:t>
+      </w:r>
+      <w:r>
+        <w:lastRenderedPageBreak/>
+        <w:t xml:space="preserve">a rendszer automatikusan az </w:t>
+      </w:r>
+      <w:r>
+        <w:rPr>
+          <w:i/>
+        </w:rPr>
+        <w:t>index.tsx</w:t>
+      </w:r>
+      <w:r>
+        <w:t xml:space="preserve">-ben meghatározott oldalra navigál. A mappastruktúrából látható, hogy a </w:t>
+      </w:r>
+      <w:r>
+        <w:rPr>
+          <w:i/>
+        </w:rPr>
+        <w:t>collections</w:t>
+      </w:r>
+      <w:r>
+        <w:t xml:space="preserve"> mappában is található egy </w:t>
+      </w:r>
+      <w:r>
+        <w:rPr>
+          <w:i/>
+        </w:rPr>
+        <w:t>index.tsx</w:t>
+      </w:r>
+      <w:r>
+        <w:t xml:space="preserve">, azonban ezen kívül további, mélyebben beágyazott oldalak is szerepelnek. Ennek megfelelően a </w:t>
+      </w:r>
+      <w:r>
+        <w:rPr>
+          <w:i/>
+        </w:rPr>
+        <w:t>collections</w:t>
+      </w:r>
+      <w:r>
+        <w:t xml:space="preserve"> útvonala </w:t>
+      </w:r>
+      <w:r>
+        <w:rPr>
+          <w:i/>
+        </w:rPr>
+        <w:t>/collections</w:t>
+      </w:r>
+      <w:r>
+        <w:t xml:space="preserve">, míg a mélyebben lévő oldalak például </w:t>
+      </w:r>
+      <w:r>
+        <w:rPr>
+          <w:i/>
+        </w:rPr>
+        <w:t>/collections/tabs</w:t>
+      </w:r>
+      <w:r>
+        <w:t xml:space="preserve"> (az ottani index), illetve </w:t>
+      </w:r>
+      <w:r>
+        <w:rPr>
+          <w:i/>
+        </w:rPr>
+        <w:t>/collections/tabs/oldalnév</w:t>
+      </w:r>
+      <w:r>
+        <w:t xml:space="preserve"> formában érhetők el.</w:t>
+      </w:r>
+    </w:p>
+    <w:p>
+      <w:pPr>
+        <w:pStyle w:val="Cmsor3"/>
+      </w:pPr>
+      <w:bookmarkStart w:id="115" w:name="_Toc214019517"/>
+      <w:r>
+        <w:t>Zustand global store</w:t>
+      </w:r>
+      <w:bookmarkEnd w:id="115"/>
+    </w:p>
+    <w:p>
+      <w:r>
+        <w:t xml:space="preserve">React applikációk fejlesztéséből már ismert lehet a </w:t>
+      </w:r>
+      <w:r>
+        <w:rPr>
+          <w:i/>
+        </w:rPr>
+        <w:t>prop drilling</w:t>
+      </w:r>
+      <w:r>
+        <w:t xml:space="preserve"> kifejezés, amikor egy magasabb szintű szülőkomponensből több lépcsőn keresztül adjuk tovább az állapotot olyan gyermekkomponenseknek, amelyeknek szükségük van rá. Ez felesleges plusz kódot eredményez, és a kód olvashatóságát is rontja, mivel bizonyos komponensek csupán azért kapnak propként állapotot, hogy továbbadhassák azt lefelé a komponensfában. Ugyanez a probléma React Native esetében is fennáll, hiszen ugyanarra a keretrendszerre épül. React Native-ben a navigáción keresztüli adatátadás további nehézségeket okoz: a paramétereket JSON formában kell átadni az útvonalhoz csatolva. Ez bonyolulttá teszi az összetett adatstruktúrák továbbítását, mivel minden esetben konverziós logikára lenne szükség az objektum → JSON és JSON → objektum átalakításokhoz. Ezt szerettem volna elkerülni, hogy a kód tisztább maradjon és időt spóroljak. Ezért választottam a globális állapottár (global store) használatát. Ez azt jelenti, hogy van egy (vagy több) központi állapottár a teljes alkalmazásban, amely bármely komponensből elérhető egy hook segítségével, így mind az állapot, mind annak módosító függvény</w:t>
+      </w:r>
+      <w:r>
+        <w:t>e könnyen hozzáférhető -</w:t>
+      </w:r>
+      <w:r>
+        <w:t xml:space="preserve"> </w:t>
+      </w:r>
+      <w:r>
+        <w:rPr>
+          <w:i/>
+        </w:rPr>
+        <w:t>prop drilling</w:t>
+      </w:r>
+      <w:r>
+        <w:t xml:space="preserve"> nélkül. Az egyik lehetséges megoldás a React beépített Context API-ja lenne, azonban ez viszonylag sok plusz előkészítést igényel: kontextusok létrehozását, az ezekhez kapcsolódó hookok megírását, valamint a megfelelő komponensek köré való wrappert. Ehelyett a Zustand könyvtárat választottam, amely nagyon egyszerűen használható, könnyen lehet vele globális store-okat létrehozni, és kiváló dokumentációval rendelkezik.</w:t>
+      </w:r>
+    </w:p>
+    <w:bookmarkStart w:id="116" w:name="_MON_1824630546"/>
+    <w:bookmarkEnd w:id="116"/>
+    <w:p>
+      <w:pPr>
+        <w:keepNext/>
+        <w:ind w:firstLine="0"/>
+      </w:pPr>
+      <w:r>
+        <w:object w:dxaOrig="9072" w:dyaOrig="3904" w14:anchorId="334749D2">
+          <v:shape id="_x0000_i1047" type="#_x0000_t75" style="width:453.6pt;height:195.2pt" o:ole="">
+            <v:imagedata r:id="rId70" o:title=""/>
+          </v:shape>
+          <o:OLEObject Type="Embed" ProgID="Word.OpenDocumentText.12" ShapeID="_x0000_i1047" DrawAspect="Content" ObjectID="_1824632449" r:id="rId71"/>
+        </w:object>
+      </w:r>
+    </w:p>
+    <w:bookmarkStart w:id="117" w:name="_Ref214017524"/>
+    <w:p>
+      <w:pPr>
+        <w:pStyle w:val="Kpalrs"/>
+      </w:pPr>
+      <w:r>
+        <w:fldChar w:fldCharType="begin"/>
+      </w:r>
+      <w:r>
+        <w:instrText xml:space="preserve"> SEQ ábra \* ARABIC </w:instrText>
+      </w:r>
+      <w:r>
+        <w:fldChar w:fldCharType="separate"/>
+      </w:r>
+      <w:r>
+        <w:rPr>
+          <w:noProof/>
+        </w:rPr>
+        <w:t>35</w:t>
+      </w:r>
+      <w:r>
+        <w:fldChar w:fldCharType="end"/>
+      </w:r>
+      <w:r>
+        <w:t>. ábra</w:t>
+      </w:r>
+      <w:bookmarkEnd w:id="117"/>
+      <w:r>
+        <w:t xml:space="preserve"> Store típus definiálása és global store létrehozása</w:t>
+      </w:r>
+    </w:p>
+    <w:p>
+      <w:r>
+        <w:t>A Zustand működését a bejelentkezett felhasználó adatait tároló globális store-on keres</w:t>
+      </w:r>
+      <w:r>
+        <w:t xml:space="preserve">ztül mutatom be, amit a </w:t>
+      </w:r>
+      <w:r>
+        <w:fldChar w:fldCharType="begin"/>
+      </w:r>
+      <w:r>
+        <w:instrText xml:space="preserve"> REF _Ref214017524 \h </w:instrText>
+      </w:r>
+      <w:r>
+        <w:fldChar w:fldCharType="separate"/>
+      </w:r>
+      <w:r>
+        <w:rPr>
+          <w:noProof/>
+        </w:rPr>
+        <w:t>35</w:t>
+      </w:r>
+      <w:r>
+        <w:t>. ábra</w:t>
+      </w:r>
+      <w:r>
+        <w:fldChar w:fldCharType="end"/>
+      </w:r>
+      <w:r>
+        <w:t xml:space="preserve"> szemléltet. Először létre kell hozni egy interfészt, amely definiálja, hogy mi legyen elérhető a store-ból. A projektemben a </w:t>
+      </w:r>
+      <w:r>
+        <w:rPr>
+          <w:i/>
+        </w:rPr>
+        <w:t>UserStore</w:t>
+      </w:r>
+      <w:r>
+        <w:t xml:space="preserve"> interfész biztosítja a struktúrát a bejelentkezett felhasználó tárolásához. A bejelentkezett felhasználóra kell a global store, mivel az adatait sok helyen használom, például megjelenítésre vagy további adatok lekérésére a backendről. A </w:t>
+      </w:r>
+      <w:r>
+        <w:rPr>
+          <w:i/>
+        </w:rPr>
+        <w:t>user</w:t>
+      </w:r>
+      <w:r>
+        <w:t xml:space="preserve"> értéke </w:t>
+      </w:r>
+      <w:r>
+        <w:rPr>
+          <w:i/>
+        </w:rPr>
+        <w:t>User</w:t>
+      </w:r>
+      <w:r>
+        <w:t xml:space="preserve"> típusú lehet, vagy </w:t>
+      </w:r>
+      <w:r>
+        <w:rPr>
+          <w:i/>
+        </w:rPr>
+        <w:t>null</w:t>
+      </w:r>
+      <w:r>
+        <w:t xml:space="preserve">, mivel a globális store a program futásának elején inicializálódik, amikor még nincs bejelentkezett felhasználó. Ezen kívül definiáltam egy setter függvényt is a </w:t>
+      </w:r>
+      <w:r>
+        <w:rPr>
+          <w:i/>
+        </w:rPr>
+        <w:t>user</w:t>
+      </w:r>
+      <w:r>
+        <w:t xml:space="preserve"> állapot frissítésére. Ezután a Zustand </w:t>
+      </w:r>
+      <w:r>
+        <w:rPr>
+          <w:i/>
+        </w:rPr>
+        <w:t>create</w:t>
+      </w:r>
+      <w:r>
+        <w:t xml:space="preserve"> függvényével létrehozom a globális store-t, ahol megadom az alapértelmezett értékeket: a </w:t>
+      </w:r>
+      <w:r>
+        <w:rPr>
+          <w:i/>
+        </w:rPr>
+        <w:t>user</w:t>
+      </w:r>
+      <w:r>
+        <w:t xml:space="preserve"> kezdetben null, a </w:t>
+      </w:r>
+      <w:r>
+        <w:rPr>
+          <w:i/>
+        </w:rPr>
+        <w:t>setUser</w:t>
+      </w:r>
+      <w:r>
+        <w:t xml:space="preserve"> pedig a Zustand által biztosított </w:t>
+      </w:r>
+      <w:r>
+        <w:rPr>
+          <w:i/>
+        </w:rPr>
+        <w:t>set</w:t>
+      </w:r>
+      <w:r>
+        <w:t xml:space="preserve"> függvény. Így egyszerűen elkészül a globális store, és innentől a </w:t>
+      </w:r>
+      <w:r>
+        <w:rPr>
+          <w:i/>
+        </w:rPr>
+        <w:t>user</w:t>
+      </w:r>
+      <w:r>
+        <w:t xml:space="preserve"> és a setter függvény bárhonnan elérhető a </w:t>
+      </w:r>
+      <w:r>
+        <w:rPr>
+          <w:i/>
+        </w:rPr>
+        <w:t>useUserStore</w:t>
+      </w:r>
+      <w:r>
+        <w:t xml:space="preserve"> hoo</w:t>
+      </w:r>
+      <w:r>
+        <w:t xml:space="preserve">k meghívásával, ahogy a </w:t>
+      </w:r>
+      <w:r>
+        <w:fldChar w:fldCharType="begin"/>
+      </w:r>
+      <w:r>
+        <w:instrText xml:space="preserve"> REF _Ref214017524 \h </w:instrText>
+      </w:r>
+      <w:r>
+        <w:fldChar w:fldCharType="separate"/>
+      </w:r>
+      <w:r>
+        <w:rPr>
+          <w:noProof/>
+        </w:rPr>
+        <w:t>35</w:t>
+      </w:r>
+      <w:r>
+        <w:t>. ábra</w:t>
+      </w:r>
+      <w:r>
+        <w:fldChar w:fldCharType="end"/>
+      </w:r>
+      <w:r>
+        <w:t xml:space="preserve"> is mutatja.</w:t>
+      </w:r>
+    </w:p>
     <w:p/>
     <w:p/>
     <w:p/>
@@ -12485,25 +13249,25 @@
       <w:pPr>
         <w:pStyle w:val="Cmsor1"/>
       </w:pPr>
-      <w:bookmarkStart w:id="108" w:name="_Toc213942517"/>
+      <w:bookmarkStart w:id="118" w:name="_Toc214019518"/>
       <w:r>
         <w:lastRenderedPageBreak/>
         <w:t>Projektértékelés</w:t>
       </w:r>
-      <w:bookmarkEnd w:id="108"/>
+      <w:bookmarkEnd w:id="118"/>
     </w:p>
     <w:p>
       <w:pPr>
         <w:pStyle w:val="Cmsor1"/>
       </w:pPr>
-      <w:bookmarkStart w:id="109" w:name="_Toc213942518"/>
+      <w:bookmarkStart w:id="119" w:name="_Toc214019519"/>
       <w:r>
         <w:lastRenderedPageBreak/>
         <w:t>Összefoglaló</w:t>
       </w:r>
-      <w:bookmarkEnd w:id="109"/>
-    </w:p>
-    <w:bookmarkStart w:id="110" w:name="_Toc213942519" w:displacedByCustomXml="next"/>
+      <w:bookmarkEnd w:id="119"/>
+    </w:p>
+    <w:bookmarkStart w:id="120" w:name="_Toc214019520" w:displacedByCustomXml="next"/>
     <w:sdt>
       <w:sdtPr>
         <w:rPr>
@@ -12533,7 +13297,7 @@
           <w:r>
             <w:t>Irodalomjegyzék</w:t>
           </w:r>
-          <w:bookmarkEnd w:id="110"/>
+          <w:bookmarkEnd w:id="120"/>
         </w:p>
         <w:sdt>
           <w:sdtPr>
@@ -13050,14 +13814,14 @@
           <w:numId w:val="0"/>
         </w:numPr>
       </w:pPr>
-      <w:bookmarkStart w:id="111" w:name="_Függelék_A_–"/>
-      <w:bookmarkStart w:id="112" w:name="_Toc213942520"/>
-      <w:bookmarkEnd w:id="111"/>
+      <w:bookmarkStart w:id="121" w:name="_Függelék_A_–"/>
+      <w:bookmarkStart w:id="122" w:name="_Toc214019521"/>
+      <w:bookmarkEnd w:id="121"/>
       <w:r>
         <w:lastRenderedPageBreak/>
         <w:t>Függelék A – Képernyőképek az applikációból</w:t>
       </w:r>
-      <w:bookmarkEnd w:id="112"/>
+      <w:bookmarkEnd w:id="122"/>
     </w:p>
     <w:p>
       <w:r>
@@ -13140,7 +13904,7 @@
                     <pic:cNvPicPr/>
                   </pic:nvPicPr>
                   <pic:blipFill>
-                    <a:blip r:embed="rId67" cstate="print">
+                    <a:blip r:embed="rId72" cstate="print">
                       <a:extLst>
                         <a:ext uri="{28A0092B-C50C-407E-A947-70E740481C1C}">
                           <a14:useLocalDpi xmlns:a14="http://schemas.microsoft.com/office/drawing/2010/main" val="0"/>
@@ -13187,7 +13951,7 @@
                     <pic:cNvPicPr/>
                   </pic:nvPicPr>
                   <pic:blipFill>
-                    <a:blip r:embed="rId68" cstate="print">
+                    <a:blip r:embed="rId73" cstate="print">
                       <a:extLst>
                         <a:ext uri="{28A0092B-C50C-407E-A947-70E740481C1C}">
                           <a14:useLocalDpi xmlns:a14="http://schemas.microsoft.com/office/drawing/2010/main" val="0"/>
@@ -13234,7 +13998,7 @@
                     <pic:cNvPicPr/>
                   </pic:nvPicPr>
                   <pic:blipFill>
-                    <a:blip r:embed="rId69" cstate="print">
+                    <a:blip r:embed="rId74" cstate="print">
                       <a:extLst>
                         <a:ext uri="{28A0092B-C50C-407E-A947-70E740481C1C}">
                           <a14:useLocalDpi xmlns:a14="http://schemas.microsoft.com/office/drawing/2010/main" val="0"/>
@@ -13281,7 +14045,7 @@
                     <pic:cNvPicPr/>
                   </pic:nvPicPr>
                   <pic:blipFill>
-                    <a:blip r:embed="rId70" cstate="print">
+                    <a:blip r:embed="rId75" cstate="print">
                       <a:extLst>
                         <a:ext uri="{28A0092B-C50C-407E-A947-70E740481C1C}">
                           <a14:useLocalDpi xmlns:a14="http://schemas.microsoft.com/office/drawing/2010/main" val="0"/>
@@ -13328,7 +14092,7 @@
                     <pic:cNvPicPr/>
                   </pic:nvPicPr>
                   <pic:blipFill>
-                    <a:blip r:embed="rId71" cstate="print">
+                    <a:blip r:embed="rId76" cstate="print">
                       <a:extLst>
                         <a:ext uri="{28A0092B-C50C-407E-A947-70E740481C1C}">
                           <a14:useLocalDpi xmlns:a14="http://schemas.microsoft.com/office/drawing/2010/main" val="0"/>
@@ -13375,7 +14139,7 @@
                     <pic:cNvPicPr/>
                   </pic:nvPicPr>
                   <pic:blipFill>
-                    <a:blip r:embed="rId72" cstate="print">
+                    <a:blip r:embed="rId77" cstate="print">
                       <a:extLst>
                         <a:ext uri="{28A0092B-C50C-407E-A947-70E740481C1C}">
                           <a14:useLocalDpi xmlns:a14="http://schemas.microsoft.com/office/drawing/2010/main" val="0"/>
@@ -13410,9 +14174,9 @@
           <w:numId w:val="0"/>
         </w:numPr>
       </w:pPr>
-      <w:bookmarkStart w:id="113" w:name="_Függelék_B_–"/>
-      <w:bookmarkStart w:id="114" w:name="_Toc213942521"/>
-      <w:bookmarkEnd w:id="113"/>
+      <w:bookmarkStart w:id="123" w:name="_Függelék_B_–"/>
+      <w:bookmarkStart w:id="124" w:name="_Toc214019522"/>
+      <w:bookmarkEnd w:id="123"/>
       <w:r>
         <w:lastRenderedPageBreak/>
         <w:t>Függelék B</w:t>
@@ -13420,16 +14184,19 @@
       <w:r>
         <w:t xml:space="preserve"> – Teljes ER diagram</w:t>
       </w:r>
-      <w:bookmarkEnd w:id="114"/>
-    </w:p>
-    <w:p>
+      <w:bookmarkEnd w:id="124"/>
+    </w:p>
+    <w:p>
+      <w:pPr>
+        <w:ind w:firstLine="0"/>
+      </w:pPr>
       <w:r>
         <w:rPr>
           <w:noProof/>
           <w:lang w:eastAsia="hu-HU"/>
         </w:rPr>
         <w:drawing>
-          <wp:inline distT="0" distB="0" distL="0" distR="0" wp14:anchorId="5B5600CF" wp14:editId="28A81362">
+          <wp:inline distT="0" distB="0" distL="0" distR="0" wp14:anchorId="5B5600CF" wp14:editId="365A4A1A">
             <wp:extent cx="8094270" cy="4811445"/>
             <wp:effectExtent l="2857" t="0" r="5398" b="5397"/>
             <wp:docPr id="10" name="Kép 10"/>
@@ -13444,7 +14211,7 @@
                     <pic:cNvPicPr/>
                   </pic:nvPicPr>
                   <pic:blipFill>
-                    <a:blip r:embed="rId73" cstate="print">
+                    <a:blip r:embed="rId78" cstate="print">
                       <a:extLst>
                         <a:ext uri="{28A0092B-C50C-407E-A947-70E740481C1C}">
                           <a14:useLocalDpi xmlns:a14="http://schemas.microsoft.com/office/drawing/2010/main" val="0"/>
@@ -13458,7 +14225,7 @@
                   <pic:spPr>
                     <a:xfrm rot="16200000">
                       <a:off x="0" y="0"/>
-                      <a:ext cx="8114280" cy="4823340"/>
+                      <a:ext cx="8094270" cy="4811445"/>
                     </a:xfrm>
                     <a:prstGeom prst="rect">
                       <a:avLst/>
@@ -13472,8 +14239,8 @@
       </w:r>
     </w:p>
     <w:sectPr>
-      <w:headerReference w:type="even" r:id="rId74"/>
-      <w:footerReference w:type="default" r:id="rId75"/>
+      <w:headerReference w:type="even" r:id="rId79"/>
+      <w:footerReference w:type="default" r:id="rId80"/>
       <w:type w:val="continuous"/>
       <w:pgSz w:w="11907" w:h="16840" w:code="9"/>
       <w:pgMar w:top="1418" w:right="1418" w:bottom="1418" w:left="1418" w:header="709" w:footer="709" w:gutter="567"/>
@@ -13487,7 +14254,7 @@
 
 <file path=word/comments.xml><?xml version="1.0" encoding="utf-8"?>
 <w:comments xmlns:wpc="http://schemas.microsoft.com/office/word/2010/wordprocessingCanvas" xmlns:cx="http://schemas.microsoft.com/office/drawing/2014/chartex" xmlns:cx1="http://schemas.microsoft.com/office/drawing/2015/9/8/chartex" xmlns:mc="http://schemas.openxmlformats.org/markup-compatibility/2006" xmlns:o="urn:schemas-microsoft-com:office:office" xmlns:r="http://schemas.openxmlformats.org/officeDocument/2006/relationships" xmlns:m="http://schemas.openxmlformats.org/officeDocument/2006/math" xmlns:v="urn:schemas-microsoft-com:vml" xmlns:wp14="http://schemas.microsoft.com/office/word/2010/wordprocessingDrawing" xmlns:wp="http://schemas.openxmlformats.org/drawingml/2006/wordprocessingDrawing" xmlns:w10="urn:schemas-microsoft-com:office:word" xmlns:w="http://schemas.openxmlformats.org/wordprocessingml/2006/main" xmlns:w14="http://schemas.microsoft.com/office/word/2010/wordml" xmlns:w15="http://schemas.microsoft.com/office/word/2012/wordml" xmlns:w16se="http://schemas.microsoft.com/office/word/2015/wordml/symex" xmlns:wpg="http://schemas.microsoft.com/office/word/2010/wordprocessingGroup" xmlns:wpi="http://schemas.microsoft.com/office/word/2010/wordprocessingInk" xmlns:wne="http://schemas.microsoft.com/office/word/2006/wordml" xmlns:wps="http://schemas.microsoft.com/office/word/2010/wordprocessingShape" mc:Ignorable="w14 w15 w16se wp14">
-  <w:comment w:id="1" w:author="Kővári Bence" w:date="2015-10-19T10:54:00Z" w:initials="KB">
+  <w:comment w:id="0" w:author="Kővári Bence" w:date="2015-10-19T10:54:00Z" w:initials="KB">
     <w:p>
       <w:pPr>
         <w:pStyle w:val="Jegyzetszveg"/>
@@ -13503,7 +14270,7 @@
       </w:r>
     </w:p>
   </w:comment>
-  <w:comment w:id="2" w:author="Kővári Bence" w:date="2015-10-19T10:55:00Z" w:initials="KB">
+  <w:comment w:id="1" w:author="Kővári Bence" w:date="2015-10-19T10:55:00Z" w:initials="KB">
     <w:p>
       <w:pPr>
         <w:pStyle w:val="Jegyzetszveg"/>
@@ -13519,7 +14286,7 @@
       </w:r>
     </w:p>
   </w:comment>
-  <w:comment w:id="3" w:author="Kővári Bence" w:date="2015-10-19T10:52:00Z" w:initials="KB">
+  <w:comment w:id="2" w:author="Kővári Bence" w:date="2015-10-19T10:52:00Z" w:initials="KB">
     <w:p>
       <w:pPr>
         <w:pStyle w:val="Jegyzetszveg"/>
@@ -13537,6 +14304,22 @@
       </w:r>
     </w:p>
   </w:comment>
+  <w:comment w:id="5" w:author="Kővári Bence" w:date="2015-10-19T11:12:00Z" w:initials="KB">
+    <w:p>
+      <w:pPr>
+        <w:pStyle w:val="Jegyzetszveg"/>
+      </w:pPr>
+      <w:r>
+        <w:rPr>
+          <w:rStyle w:val="Jegyzethivatkozs"/>
+        </w:rPr>
+        <w:annotationRef/>
+      </w:r>
+      <w:r>
+        <w:t>motiváció</w:t>
+      </w:r>
+    </w:p>
+  </w:comment>
   <w:comment w:id="6" w:author="Kővári Bence" w:date="2015-10-19T11:12:00Z" w:initials="KB">
     <w:p>
       <w:pPr>
@@ -13549,11 +14332,11 @@
         <w:annotationRef/>
       </w:r>
       <w:r>
-        <w:t>motiváció</w:t>
+        <w:t>probléma bemutatása</w:t>
       </w:r>
     </w:p>
   </w:comment>
-  <w:comment w:id="7" w:author="Kővári Bence" w:date="2015-10-19T11:12:00Z" w:initials="KB">
+  <w:comment w:id="7" w:author="Kővári Bence" w:date="2015-10-19T11:13:00Z" w:initials="KB">
     <w:p>
       <w:pPr>
         <w:pStyle w:val="Jegyzetszveg"/>
@@ -13565,11 +14348,11 @@
         <w:annotationRef/>
       </w:r>
       <w:r>
-        <w:t>probléma bemutatása</w:t>
+        <w:t>megoldás bemutatása</w:t>
       </w:r>
     </w:p>
   </w:comment>
-  <w:comment w:id="8" w:author="Kővári Bence" w:date="2015-10-19T11:13:00Z" w:initials="KB">
+  <w:comment w:id="8" w:author="Kővári Bence" w:date="2015-10-19T11:17:00Z" w:initials="KB">
     <w:p>
       <w:pPr>
         <w:pStyle w:val="Jegyzetszveg"/>
@@ -13581,27 +14364,11 @@
         <w:annotationRef/>
       </w:r>
       <w:r>
-        <w:t>megoldás bemutatása</w:t>
+        <w:t>eredmény összefoglalása</w:t>
       </w:r>
     </w:p>
   </w:comment>
   <w:comment w:id="9" w:author="Kővári Bence" w:date="2015-10-19T11:17:00Z" w:initials="KB">
-    <w:p>
-      <w:pPr>
-        <w:pStyle w:val="Jegyzetszveg"/>
-      </w:pPr>
-      <w:r>
-        <w:rPr>
-          <w:rStyle w:val="Jegyzethivatkozs"/>
-        </w:rPr>
-        <w:annotationRef/>
-      </w:r>
-      <w:r>
-        <w:t>eredmény összefoglalása</w:t>
-      </w:r>
-    </w:p>
-  </w:comment>
-  <w:comment w:id="10" w:author="Kővári Bence" w:date="2015-10-19T11:17:00Z" w:initials="KB">
     <w:p>
       <w:pPr>
         <w:pStyle w:val="Jegyzetszveg"/>
@@ -13723,7 +14490,7 @@
         <w:rStyle w:val="Oldalszm"/>
         <w:noProof/>
       </w:rPr>
-      <w:t>22</w:t>
+      <w:t>31</w:t>
     </w:r>
     <w:r>
       <w:rPr>
@@ -18043,7 +18810,7 @@
     <w:next w:val="Norml"/>
     <w:autoRedefine/>
     <w:qFormat/>
-    <w:rsid w:val="00367BE5"/>
+    <w:rsid w:val="00D569E8"/>
     <w:pPr>
       <w:spacing w:before="120" w:after="240"/>
       <w:ind w:firstLine="0"/>
@@ -19262,7 +20029,7 @@
 </file>
 
 <file path=customXml/itemProps1.xml><?xml version="1.0" encoding="utf-8"?>
-<ds:datastoreItem xmlns:ds="http://schemas.openxmlformats.org/officeDocument/2006/customXml" ds:itemID="{F407D03C-46CF-4A73-962D-90B303962407}">
+<ds:datastoreItem xmlns:ds="http://schemas.openxmlformats.org/officeDocument/2006/customXml" ds:itemID="{066CF6BC-10B9-4B89-A878-CAB5171BF0A8}">
   <ds:schemaRefs>
     <ds:schemaRef ds:uri="http://schemas.openxmlformats.org/officeDocument/2006/bibliography"/>
   </ds:schemaRefs>

</xml_diff>